<commit_message>
Updated the Penetration Testing Report secondary document (higher resolution diagrams / replaced risk assessment step with triage one)
</commit_message>
<xml_diff>
--- a/source/reference_documents/secondary_documents/verification phase/Penetration Testing Report/Penetration Testing Report.docx
+++ b/source/reference_documents/secondary_documents/verification phase/Penetration Testing Report/Penetration Testing Report.docx
@@ -1,6 +1,6 @@
 
 <file path=word/document.xml><?xml version="1.0" encoding="utf-8"?>
-<w:document xmlns:wpc="http://schemas.microsoft.com/office/word/2010/wordprocessingCanvas" xmlns:cx="http://schemas.microsoft.com/office/drawing/2014/chartex" xmlns:cx1="http://schemas.microsoft.com/office/drawing/2015/9/8/chartex" xmlns:cx2="http://schemas.microsoft.com/office/drawing/2015/10/21/chartex" xmlns:cx3="http://schemas.microsoft.com/office/drawing/2016/5/9/chartex" xmlns:cx4="http://schemas.microsoft.com/office/drawing/2016/5/10/chartex" xmlns:cx5="http://schemas.microsoft.com/office/drawing/2016/5/11/chartex" xmlns:cx6="http://schemas.microsoft.com/office/drawing/2016/5/12/chartex" xmlns:cx7="http://schemas.microsoft.com/office/drawing/2016/5/13/chartex" xmlns:cx8="http://schemas.microsoft.com/office/drawing/2016/5/14/chartex" xmlns:mc="http://schemas.openxmlformats.org/markup-compatibility/2006" xmlns:aink="http://schemas.microsoft.com/office/drawing/2016/ink" xmlns:am3d="http://schemas.microsoft.com/office/drawing/2017/model3d" xmlns:o="urn:schemas-microsoft-com:office:office" xmlns:oel="http://schemas.microsoft.com/office/2019/extlst" xmlns:r="http://schemas.openxmlformats.org/officeDocument/2006/relationships" xmlns:m="http://schemas.openxmlformats.org/officeDocument/2006/math" xmlns:v="urn:schemas-microsoft-com:vml" xmlns:wp14="http://schemas.microsoft.com/office/word/2010/wordprocessingDrawing" xmlns:wp="http://schemas.openxmlformats.org/drawingml/2006/wordprocessingDrawing" xmlns:w10="urn:schemas-microsoft-com:office:word" xmlns:w="http://schemas.openxmlformats.org/wordprocessingml/2006/main" xmlns:w14="http://schemas.microsoft.com/office/word/2010/wordml" xmlns:w15="http://schemas.microsoft.com/office/word/2012/wordml" xmlns:w16cex="http://schemas.microsoft.com/office/word/2018/wordml/cex" xmlns:w16cid="http://schemas.microsoft.com/office/word/2016/wordml/cid" xmlns:w16="http://schemas.microsoft.com/office/word/2018/wordml" xmlns:w16sdtdh="http://schemas.microsoft.com/office/word/2020/wordml/sdtdatahash" xmlns:w16se="http://schemas.microsoft.com/office/word/2015/wordml/symex" xmlns:wpg="http://schemas.microsoft.com/office/word/2010/wordprocessingGroup" xmlns:wpi="http://schemas.microsoft.com/office/word/2010/wordprocessingInk" xmlns:wne="http://schemas.microsoft.com/office/word/2006/wordml" xmlns:wps="http://schemas.microsoft.com/office/word/2010/wordprocessingShape" mc:Ignorable="w14 w15 w16se w16cid w16 w16cex w16sdtdh wp14">
+<w:document xmlns:wpc="http://schemas.microsoft.com/office/word/2010/wordprocessingCanvas" xmlns:cx="http://schemas.microsoft.com/office/drawing/2014/chartex" xmlns:cx1="http://schemas.microsoft.com/office/drawing/2015/9/8/chartex" xmlns:cx2="http://schemas.microsoft.com/office/drawing/2015/10/21/chartex" xmlns:cx3="http://schemas.microsoft.com/office/drawing/2016/5/9/chartex" xmlns:cx4="http://schemas.microsoft.com/office/drawing/2016/5/10/chartex" xmlns:cx5="http://schemas.microsoft.com/office/drawing/2016/5/11/chartex" xmlns:cx6="http://schemas.microsoft.com/office/drawing/2016/5/12/chartex" xmlns:cx7="http://schemas.microsoft.com/office/drawing/2016/5/13/chartex" xmlns:cx8="http://schemas.microsoft.com/office/drawing/2016/5/14/chartex" xmlns:mc="http://schemas.openxmlformats.org/markup-compatibility/2006" xmlns:aink="http://schemas.microsoft.com/office/drawing/2016/ink" xmlns:am3d="http://schemas.microsoft.com/office/drawing/2017/model3d" xmlns:o="urn:schemas-microsoft-com:office:office" xmlns:oel="http://schemas.microsoft.com/office/2019/extlst" xmlns:r="http://schemas.openxmlformats.org/officeDocument/2006/relationships" xmlns:m="http://schemas.openxmlformats.org/officeDocument/2006/math" xmlns:v="urn:schemas-microsoft-com:vml" xmlns:wp14="http://schemas.microsoft.com/office/word/2010/wordprocessingDrawing" xmlns:wp="http://schemas.openxmlformats.org/drawingml/2006/wordprocessingDrawing" xmlns:w10="urn:schemas-microsoft-com:office:word" xmlns:w="http://schemas.openxmlformats.org/wordprocessingml/2006/main" xmlns:w14="http://schemas.microsoft.com/office/word/2010/wordml" xmlns:w15="http://schemas.microsoft.com/office/word/2012/wordml" xmlns:w16cex="http://schemas.microsoft.com/office/word/2018/wordml/cex" xmlns:w16cid="http://schemas.microsoft.com/office/word/2016/wordml/cid" xmlns:w16="http://schemas.microsoft.com/office/word/2018/wordml" xmlns:w16du="http://schemas.microsoft.com/office/word/2023/wordml/word16du" xmlns:w16sdtdh="http://schemas.microsoft.com/office/word/2020/wordml/sdtdatahash" xmlns:w16sdtfl="http://schemas.microsoft.com/office/word/2024/wordml/sdtformatlock" xmlns:w16se="http://schemas.microsoft.com/office/word/2015/wordml/symex" xmlns:wpg="http://schemas.microsoft.com/office/word/2010/wordprocessingGroup" xmlns:wpi="http://schemas.microsoft.com/office/word/2010/wordprocessingInk" xmlns:wne="http://schemas.microsoft.com/office/word/2006/wordml" xmlns:wps="http://schemas.microsoft.com/office/word/2010/wordprocessingShape" mc:Ignorable="w14 w15 w16se w16cid w16 w16cex w16sdtdh w16sdtfl w16du wp14">
   <w:body>
     <w:p>
       <w:pPr>
@@ -28,7 +28,7 @@
         <w:t xml:space="preserve">Version </w:t>
       </w:r>
       <w:r>
-        <w:t>7</w:t>
+        <w:t>8</w:t>
       </w:r>
     </w:p>
     <w:p>
@@ -45,7 +45,7 @@
         <w:rPr>
           <w:noProof/>
         </w:rPr>
-        <w:t>9/8/23 12:36 PM</w:t>
+        <w:t>1/21/26 8:26 AM</w:t>
       </w:r>
       <w:r>
         <w:fldChar w:fldCharType="end"/>
@@ -158,45 +158,13 @@
         <w:jc w:val="both"/>
       </w:pPr>
       <w:r>
-        <w:t xml:space="preserve">This document is motivated by the need to have whole-system, security-related feedback in the development of safety-critical, cyber-physical systems for certification of compliance to standards such as </w:t>
-      </w:r>
-      <w:r>
-        <w:rPr>
-          <w:b/>
-          <w:bCs/>
-        </w:rPr>
-        <w:t>ISO</w:t>
-      </w:r>
-      <w:r>
-        <w:rPr>
-          <w:b/>
-          <w:bCs/>
-        </w:rPr>
-        <w:t>/SAE</w:t>
-      </w:r>
-      <w:r>
-        <w:rPr>
-          <w:b/>
-          <w:bCs/>
-        </w:rPr>
-        <w:t xml:space="preserve"> 21434</w:t>
-      </w:r>
-      <w:r>
-        <w:t xml:space="preserve"> and </w:t>
-      </w:r>
-      <w:r>
-        <w:rPr>
-          <w:b/>
-          <w:bCs/>
-        </w:rPr>
-        <w:t xml:space="preserve">ISO </w:t>
-      </w:r>
-      <w:r>
-        <w:rPr>
-          <w:b/>
-          <w:bCs/>
-        </w:rPr>
-        <w:t>26262</w:t>
+        <w:t xml:space="preserve">This document is motivated by the need to have whole-system, </w:t>
+      </w:r>
+      <w:r>
+        <w:t>cyber</w:t>
+      </w:r>
+      <w:r>
+        <w:t>security-related feedback in the development of safety-critical, cyber-physical systems</w:t>
       </w:r>
       <w:r>
         <w:t>.</w:t>
@@ -227,7 +195,19 @@
         <w:rPr>
           <w:lang w:val="en-US"/>
         </w:rPr>
-        <w:t xml:space="preserve">was created by </w:t>
+        <w:t xml:space="preserve">was </w:t>
+      </w:r>
+      <w:r>
+        <w:rPr>
+          <w:lang w:val="en-US"/>
+        </w:rPr>
+        <w:t xml:space="preserve">originally </w:t>
+      </w:r>
+      <w:r>
+        <w:rPr>
+          <w:lang w:val="en-US"/>
+        </w:rPr>
+        <w:t xml:space="preserve">created by </w:t>
       </w:r>
       <w:r>
         <w:rPr>
@@ -364,9 +344,9 @@
           <w:noProof/>
         </w:rPr>
         <w:drawing>
-          <wp:inline distT="0" distB="0" distL="0" distR="0" wp14:anchorId="50BC6905" wp14:editId="41A885DA">
-            <wp:extent cx="5905050" cy="1761067"/>
-            <wp:effectExtent l="0" t="0" r="635" b="4445"/>
+          <wp:inline distT="0" distB="0" distL="0" distR="0" wp14:anchorId="50BC6905" wp14:editId="2E83D47E">
+            <wp:extent cx="5905050" cy="1758245"/>
+            <wp:effectExtent l="0" t="0" r="635" b="0"/>
             <wp:docPr id="1" name="Picture 1"/>
             <wp:cNvGraphicFramePr>
               <a:graphicFrameLocks xmlns:a="http://schemas.openxmlformats.org/drawingml/2006/main" noChangeAspect="1"/>
@@ -393,7 +373,7 @@
                   <pic:spPr>
                     <a:xfrm>
                       <a:off x="0" y="0"/>
-                      <a:ext cx="5905050" cy="1761067"/>
+                      <a:ext cx="5905050" cy="1758245"/>
                     </a:xfrm>
                     <a:prstGeom prst="rect">
                       <a:avLst/>
@@ -459,7 +439,6 @@
         <w:tc>
           <w:tcPr>
             <w:tcW w:w="1520" w:type="dxa"/>
-            <w:shd w:val="clear" w:color="auto" w:fill="auto"/>
             <w:tcMar>
               <w:top w:w="100" w:type="dxa"/>
               <w:left w:w="100" w:type="dxa"/>
@@ -490,7 +469,6 @@
         <w:tc>
           <w:tcPr>
             <w:tcW w:w="3420" w:type="dxa"/>
-            <w:shd w:val="clear" w:color="auto" w:fill="auto"/>
             <w:tcMar>
               <w:top w:w="100" w:type="dxa"/>
               <w:left w:w="100" w:type="dxa"/>
@@ -513,7 +491,6 @@
         <w:tc>
           <w:tcPr>
             <w:tcW w:w="1520" w:type="dxa"/>
-            <w:shd w:val="clear" w:color="auto" w:fill="auto"/>
             <w:tcMar>
               <w:top w:w="100" w:type="dxa"/>
               <w:left w:w="100" w:type="dxa"/>
@@ -544,7 +521,6 @@
         <w:tc>
           <w:tcPr>
             <w:tcW w:w="3420" w:type="dxa"/>
-            <w:shd w:val="clear" w:color="auto" w:fill="auto"/>
             <w:tcMar>
               <w:top w:w="100" w:type="dxa"/>
               <w:left w:w="100" w:type="dxa"/>
@@ -567,7 +543,6 @@
         <w:tc>
           <w:tcPr>
             <w:tcW w:w="1520" w:type="dxa"/>
-            <w:shd w:val="clear" w:color="auto" w:fill="auto"/>
             <w:tcMar>
               <w:top w:w="100" w:type="dxa"/>
               <w:left w:w="100" w:type="dxa"/>
@@ -598,7 +573,6 @@
         <w:tc>
           <w:tcPr>
             <w:tcW w:w="3420" w:type="dxa"/>
-            <w:shd w:val="clear" w:color="auto" w:fill="auto"/>
             <w:tcMar>
               <w:top w:w="100" w:type="dxa"/>
               <w:left w:w="100" w:type="dxa"/>
@@ -652,9 +626,9 @@
           <w:noProof/>
         </w:rPr>
         <w:drawing>
-          <wp:inline distT="0" distB="0" distL="0" distR="0" wp14:anchorId="4B38BCDD" wp14:editId="5DD1B06D">
-            <wp:extent cx="3580016" cy="4410647"/>
-            <wp:effectExtent l="0" t="0" r="1905" b="0"/>
+          <wp:inline distT="0" distB="0" distL="0" distR="0" wp14:anchorId="4B38BCDD" wp14:editId="1650A2D7">
+            <wp:extent cx="3578449" cy="4410647"/>
+            <wp:effectExtent l="0" t="0" r="3175" b="0"/>
             <wp:docPr id="15" name="Picture 15"/>
             <wp:cNvGraphicFramePr>
               <a:graphicFrameLocks xmlns:a="http://schemas.openxmlformats.org/drawingml/2006/main" noChangeAspect="1"/>
@@ -667,7 +641,7 @@
                     <pic:cNvPicPr/>
                   </pic:nvPicPr>
                   <pic:blipFill>
-                    <a:blip r:embed="rId9">
+                    <a:blip r:embed="rId9" cstate="print">
                       <a:extLst>
                         <a:ext uri="{28A0092B-C50C-407E-A947-70E740481C1C}">
                           <a14:useLocalDpi xmlns:a14="http://schemas.microsoft.com/office/drawing/2010/main" val="0"/>
@@ -681,7 +655,7 @@
                   <pic:spPr>
                     <a:xfrm>
                       <a:off x="0" y="0"/>
-                      <a:ext cx="3580016" cy="4410647"/>
+                      <a:ext cx="3578449" cy="4410647"/>
                     </a:xfrm>
                     <a:prstGeom prst="rect">
                       <a:avLst/>
@@ -840,7 +814,6 @@
         <w:tc>
           <w:tcPr>
             <w:tcW w:w="1520" w:type="dxa"/>
-            <w:shd w:val="clear" w:color="auto" w:fill="auto"/>
             <w:tcMar>
               <w:top w:w="100" w:type="dxa"/>
               <w:left w:w="100" w:type="dxa"/>
@@ -871,7 +844,6 @@
         <w:tc>
           <w:tcPr>
             <w:tcW w:w="3420" w:type="dxa"/>
-            <w:shd w:val="clear" w:color="auto" w:fill="auto"/>
             <w:tcMar>
               <w:top w:w="100" w:type="dxa"/>
               <w:left w:w="100" w:type="dxa"/>
@@ -903,7 +875,6 @@
         <w:tc>
           <w:tcPr>
             <w:tcW w:w="1520" w:type="dxa"/>
-            <w:shd w:val="clear" w:color="auto" w:fill="auto"/>
             <w:tcMar>
               <w:top w:w="100" w:type="dxa"/>
               <w:left w:w="100" w:type="dxa"/>
@@ -934,7 +905,6 @@
         <w:tc>
           <w:tcPr>
             <w:tcW w:w="3420" w:type="dxa"/>
-            <w:shd w:val="clear" w:color="auto" w:fill="auto"/>
             <w:tcMar>
               <w:top w:w="100" w:type="dxa"/>
               <w:left w:w="100" w:type="dxa"/>
@@ -957,7 +927,6 @@
         <w:tc>
           <w:tcPr>
             <w:tcW w:w="1520" w:type="dxa"/>
-            <w:shd w:val="clear" w:color="auto" w:fill="auto"/>
             <w:tcMar>
               <w:top w:w="100" w:type="dxa"/>
               <w:left w:w="100" w:type="dxa"/>
@@ -988,7 +957,6 @@
         <w:tc>
           <w:tcPr>
             <w:tcW w:w="3420" w:type="dxa"/>
-            <w:shd w:val="clear" w:color="auto" w:fill="auto"/>
             <w:tcMar>
               <w:top w:w="100" w:type="dxa"/>
               <w:left w:w="100" w:type="dxa"/>
@@ -1018,9 +986,9 @@
           <w:noProof/>
         </w:rPr>
         <w:drawing>
-          <wp:inline distT="0" distB="0" distL="0" distR="0" wp14:anchorId="68F8C9BA" wp14:editId="5A07D3A9">
-            <wp:extent cx="3579552" cy="4410075"/>
-            <wp:effectExtent l="0" t="0" r="1905" b="0"/>
+          <wp:inline distT="0" distB="0" distL="0" distR="0" wp14:anchorId="68F8C9BA" wp14:editId="1FF85E91">
+            <wp:extent cx="3578677" cy="4410928"/>
+            <wp:effectExtent l="0" t="0" r="3175" b="0"/>
             <wp:docPr id="2" name="Picture 2"/>
             <wp:cNvGraphicFramePr>
               <a:graphicFrameLocks xmlns:a="http://schemas.openxmlformats.org/drawingml/2006/main" noChangeAspect="1"/>
@@ -1033,7 +1001,7 @@
                     <pic:cNvPicPr/>
                   </pic:nvPicPr>
                   <pic:blipFill>
-                    <a:blip r:embed="rId10">
+                    <a:blip r:embed="rId10" cstate="print">
                       <a:extLst>
                         <a:ext uri="{28A0092B-C50C-407E-A947-70E740481C1C}">
                           <a14:useLocalDpi xmlns:a14="http://schemas.microsoft.com/office/drawing/2010/main" val="0"/>
@@ -1047,7 +1015,7 @@
                   <pic:spPr>
                     <a:xfrm>
                       <a:off x="0" y="0"/>
-                      <a:ext cx="3580244" cy="4410928"/>
+                      <a:ext cx="3578677" cy="4410928"/>
                     </a:xfrm>
                     <a:prstGeom prst="rect">
                       <a:avLst/>
@@ -1104,7 +1072,25 @@
           <w:color w:val="0070C0"/>
           <w:vertAlign w:val="superscript"/>
         </w:rPr>
-        <w:t>[4, 5, 6, 7]</w:t>
+        <w:t>[</w:t>
+      </w:r>
+      <w:r>
+        <w:rPr>
+          <w:b/>
+          <w:bCs/>
+          <w:color w:val="0070C0"/>
+          <w:vertAlign w:val="superscript"/>
+        </w:rPr>
+        <w:t xml:space="preserve">3, </w:t>
+      </w:r>
+      <w:r>
+        <w:rPr>
+          <w:b/>
+          <w:bCs/>
+          <w:color w:val="0070C0"/>
+          <w:vertAlign w:val="superscript"/>
+        </w:rPr>
+        <w:t>4, 5, 6]</w:t>
       </w:r>
       <w:r>
         <w:t>, t</w:t>
@@ -1263,7 +1249,6 @@
         <w:tc>
           <w:tcPr>
             <w:tcW w:w="1520" w:type="dxa"/>
-            <w:shd w:val="clear" w:color="auto" w:fill="auto"/>
             <w:tcMar>
               <w:top w:w="100" w:type="dxa"/>
               <w:left w:w="100" w:type="dxa"/>
@@ -1294,7 +1279,6 @@
         <w:tc>
           <w:tcPr>
             <w:tcW w:w="3420" w:type="dxa"/>
-            <w:shd w:val="clear" w:color="auto" w:fill="auto"/>
             <w:tcMar>
               <w:top w:w="100" w:type="dxa"/>
               <w:left w:w="100" w:type="dxa"/>
@@ -1326,7 +1310,6 @@
         <w:tc>
           <w:tcPr>
             <w:tcW w:w="1520" w:type="dxa"/>
-            <w:shd w:val="clear" w:color="auto" w:fill="auto"/>
             <w:tcMar>
               <w:top w:w="100" w:type="dxa"/>
               <w:left w:w="100" w:type="dxa"/>
@@ -1357,7 +1340,6 @@
         <w:tc>
           <w:tcPr>
             <w:tcW w:w="3420" w:type="dxa"/>
-            <w:shd w:val="clear" w:color="auto" w:fill="auto"/>
             <w:tcMar>
               <w:top w:w="100" w:type="dxa"/>
               <w:left w:w="100" w:type="dxa"/>
@@ -1380,7 +1362,6 @@
         <w:tc>
           <w:tcPr>
             <w:tcW w:w="1520" w:type="dxa"/>
-            <w:shd w:val="clear" w:color="auto" w:fill="auto"/>
             <w:tcMar>
               <w:top w:w="100" w:type="dxa"/>
               <w:left w:w="100" w:type="dxa"/>
@@ -1411,7 +1392,6 @@
         <w:tc>
           <w:tcPr>
             <w:tcW w:w="3420" w:type="dxa"/>
-            <w:shd w:val="clear" w:color="auto" w:fill="auto"/>
             <w:tcMar>
               <w:top w:w="100" w:type="dxa"/>
               <w:left w:w="100" w:type="dxa"/>
@@ -1441,9 +1421,9 @@
           <w:noProof/>
         </w:rPr>
         <w:drawing>
-          <wp:inline distT="0" distB="0" distL="0" distR="0" wp14:anchorId="6AAD04CA" wp14:editId="5154D766">
-            <wp:extent cx="3970020" cy="4410212"/>
-            <wp:effectExtent l="0" t="0" r="5080" b="0"/>
+          <wp:inline distT="0" distB="0" distL="0" distR="0" wp14:anchorId="6AAD04CA" wp14:editId="0D8AC6C6">
+            <wp:extent cx="3970692" cy="4411880"/>
+            <wp:effectExtent l="0" t="0" r="4445" b="0"/>
             <wp:docPr id="3" name="Picture 3"/>
             <wp:cNvGraphicFramePr>
               <a:graphicFrameLocks xmlns:a="http://schemas.openxmlformats.org/drawingml/2006/main" noChangeAspect="1"/>
@@ -1456,7 +1436,7 @@
                     <pic:cNvPicPr/>
                   </pic:nvPicPr>
                   <pic:blipFill>
-                    <a:blip r:embed="rId11">
+                    <a:blip r:embed="rId11" cstate="print">
                       <a:extLst>
                         <a:ext uri="{28A0092B-C50C-407E-A947-70E740481C1C}">
                           <a14:useLocalDpi xmlns:a14="http://schemas.microsoft.com/office/drawing/2010/main" val="0"/>
@@ -1470,7 +1450,7 @@
                   <pic:spPr>
                     <a:xfrm>
                       <a:off x="0" y="0"/>
-                      <a:ext cx="3971522" cy="4411880"/>
+                      <a:ext cx="3970692" cy="4411880"/>
                     </a:xfrm>
                     <a:prstGeom prst="rect">
                       <a:avLst/>
@@ -1641,7 +1621,6 @@
         <w:tc>
           <w:tcPr>
             <w:tcW w:w="1520" w:type="dxa"/>
-            <w:shd w:val="clear" w:color="auto" w:fill="auto"/>
             <w:tcMar>
               <w:top w:w="100" w:type="dxa"/>
               <w:left w:w="100" w:type="dxa"/>
@@ -1672,7 +1651,6 @@
         <w:tc>
           <w:tcPr>
             <w:tcW w:w="3420" w:type="dxa"/>
-            <w:shd w:val="clear" w:color="auto" w:fill="auto"/>
             <w:tcMar>
               <w:top w:w="100" w:type="dxa"/>
               <w:left w:w="100" w:type="dxa"/>
@@ -1695,7 +1673,6 @@
         <w:tc>
           <w:tcPr>
             <w:tcW w:w="1520" w:type="dxa"/>
-            <w:shd w:val="clear" w:color="auto" w:fill="auto"/>
             <w:tcMar>
               <w:top w:w="100" w:type="dxa"/>
               <w:left w:w="100" w:type="dxa"/>
@@ -1726,7 +1703,6 @@
         <w:tc>
           <w:tcPr>
             <w:tcW w:w="3420" w:type="dxa"/>
-            <w:shd w:val="clear" w:color="auto" w:fill="auto"/>
             <w:tcMar>
               <w:top w:w="100" w:type="dxa"/>
               <w:left w:w="100" w:type="dxa"/>
@@ -1749,7 +1725,6 @@
         <w:tc>
           <w:tcPr>
             <w:tcW w:w="1520" w:type="dxa"/>
-            <w:shd w:val="clear" w:color="auto" w:fill="auto"/>
             <w:tcMar>
               <w:top w:w="100" w:type="dxa"/>
               <w:left w:w="100" w:type="dxa"/>
@@ -1780,7 +1755,6 @@
         <w:tc>
           <w:tcPr>
             <w:tcW w:w="3420" w:type="dxa"/>
-            <w:shd w:val="clear" w:color="auto" w:fill="auto"/>
             <w:tcMar>
               <w:top w:w="100" w:type="dxa"/>
               <w:left w:w="100" w:type="dxa"/>
@@ -1810,9 +1784,9 @@
           <w:noProof/>
         </w:rPr>
         <w:drawing>
-          <wp:inline distT="0" distB="0" distL="0" distR="0" wp14:anchorId="53213373" wp14:editId="3FDE7590">
-            <wp:extent cx="3413760" cy="4410479"/>
-            <wp:effectExtent l="0" t="0" r="2540" b="0"/>
+          <wp:inline distT="0" distB="0" distL="0" distR="0" wp14:anchorId="53213373" wp14:editId="1C9B514D">
+            <wp:extent cx="3418472" cy="4408248"/>
+            <wp:effectExtent l="0" t="0" r="0" b="0"/>
             <wp:docPr id="4" name="Picture 4"/>
             <wp:cNvGraphicFramePr>
               <a:graphicFrameLocks xmlns:a="http://schemas.openxmlformats.org/drawingml/2006/main" noChangeAspect="1"/>
@@ -1825,7 +1799,7 @@
                     <pic:cNvPicPr/>
                   </pic:nvPicPr>
                   <pic:blipFill>
-                    <a:blip r:embed="rId12">
+                    <a:blip r:embed="rId12" cstate="print">
                       <a:extLst>
                         <a:ext uri="{28A0092B-C50C-407E-A947-70E740481C1C}">
                           <a14:useLocalDpi xmlns:a14="http://schemas.microsoft.com/office/drawing/2010/main" val="0"/>
@@ -1839,7 +1813,7 @@
                   <pic:spPr>
                     <a:xfrm>
                       <a:off x="0" y="0"/>
-                      <a:ext cx="3418472" cy="4416567"/>
+                      <a:ext cx="3418472" cy="4408248"/>
                     </a:xfrm>
                     <a:prstGeom prst="rect">
                       <a:avLst/>
@@ -1950,7 +1924,6 @@
         <w:tc>
           <w:tcPr>
             <w:tcW w:w="1520" w:type="dxa"/>
-            <w:shd w:val="clear" w:color="auto" w:fill="auto"/>
             <w:tcMar>
               <w:top w:w="100" w:type="dxa"/>
               <w:left w:w="100" w:type="dxa"/>
@@ -1981,7 +1954,6 @@
         <w:tc>
           <w:tcPr>
             <w:tcW w:w="3420" w:type="dxa"/>
-            <w:shd w:val="clear" w:color="auto" w:fill="auto"/>
             <w:tcMar>
               <w:top w:w="100" w:type="dxa"/>
               <w:left w:w="100" w:type="dxa"/>
@@ -2013,7 +1985,6 @@
         <w:tc>
           <w:tcPr>
             <w:tcW w:w="1520" w:type="dxa"/>
-            <w:shd w:val="clear" w:color="auto" w:fill="auto"/>
             <w:tcMar>
               <w:top w:w="100" w:type="dxa"/>
               <w:left w:w="100" w:type="dxa"/>
@@ -2044,7 +2015,6 @@
         <w:tc>
           <w:tcPr>
             <w:tcW w:w="3420" w:type="dxa"/>
-            <w:shd w:val="clear" w:color="auto" w:fill="auto"/>
             <w:tcMar>
               <w:top w:w="100" w:type="dxa"/>
               <w:left w:w="100" w:type="dxa"/>
@@ -2067,7 +2037,6 @@
         <w:tc>
           <w:tcPr>
             <w:tcW w:w="1520" w:type="dxa"/>
-            <w:shd w:val="clear" w:color="auto" w:fill="auto"/>
             <w:tcMar>
               <w:top w:w="100" w:type="dxa"/>
               <w:left w:w="100" w:type="dxa"/>
@@ -2098,7 +2067,6 @@
         <w:tc>
           <w:tcPr>
             <w:tcW w:w="3420" w:type="dxa"/>
-            <w:shd w:val="clear" w:color="auto" w:fill="auto"/>
             <w:tcMar>
               <w:top w:w="100" w:type="dxa"/>
               <w:left w:w="100" w:type="dxa"/>
@@ -2128,9 +2096,9 @@
           <w:noProof/>
         </w:rPr>
         <w:drawing>
-          <wp:inline distT="0" distB="0" distL="0" distR="0" wp14:anchorId="6776D760" wp14:editId="4948F6DC">
-            <wp:extent cx="4387175" cy="4387175"/>
-            <wp:effectExtent l="0" t="0" r="0" b="0"/>
+          <wp:inline distT="0" distB="0" distL="0" distR="0" wp14:anchorId="6776D760" wp14:editId="4C16AA97">
+            <wp:extent cx="4398514" cy="4390230"/>
+            <wp:effectExtent l="0" t="0" r="0" b="4445"/>
             <wp:docPr id="5" name="Picture 5"/>
             <wp:cNvGraphicFramePr>
               <a:graphicFrameLocks xmlns:a="http://schemas.openxmlformats.org/drawingml/2006/main" noChangeAspect="1"/>
@@ -2143,7 +2111,7 @@
                     <pic:cNvPicPr/>
                   </pic:nvPicPr>
                   <pic:blipFill>
-                    <a:blip r:embed="rId13">
+                    <a:blip r:embed="rId13" cstate="print">
                       <a:extLst>
                         <a:ext uri="{28A0092B-C50C-407E-A947-70E740481C1C}">
                           <a14:useLocalDpi xmlns:a14="http://schemas.microsoft.com/office/drawing/2010/main" val="0"/>
@@ -2157,7 +2125,7 @@
                   <pic:spPr>
                     <a:xfrm>
                       <a:off x="0" y="0"/>
-                      <a:ext cx="4398514" cy="4398514"/>
+                      <a:ext cx="4398514" cy="4390230"/>
                     </a:xfrm>
                     <a:prstGeom prst="rect">
                       <a:avLst/>
@@ -2282,7 +2250,6 @@
         <w:tc>
           <w:tcPr>
             <w:tcW w:w="1520" w:type="dxa"/>
-            <w:shd w:val="clear" w:color="auto" w:fill="auto"/>
             <w:tcMar>
               <w:top w:w="100" w:type="dxa"/>
               <w:left w:w="100" w:type="dxa"/>
@@ -2313,7 +2280,6 @@
         <w:tc>
           <w:tcPr>
             <w:tcW w:w="3420" w:type="dxa"/>
-            <w:shd w:val="clear" w:color="auto" w:fill="auto"/>
             <w:tcMar>
               <w:top w:w="100" w:type="dxa"/>
               <w:left w:w="100" w:type="dxa"/>
@@ -2345,7 +2311,6 @@
         <w:tc>
           <w:tcPr>
             <w:tcW w:w="1520" w:type="dxa"/>
-            <w:shd w:val="clear" w:color="auto" w:fill="auto"/>
             <w:tcMar>
               <w:top w:w="100" w:type="dxa"/>
               <w:left w:w="100" w:type="dxa"/>
@@ -2376,7 +2341,6 @@
         <w:tc>
           <w:tcPr>
             <w:tcW w:w="3420" w:type="dxa"/>
-            <w:shd w:val="clear" w:color="auto" w:fill="auto"/>
             <w:tcMar>
               <w:top w:w="100" w:type="dxa"/>
               <w:left w:w="100" w:type="dxa"/>
@@ -2399,7 +2363,6 @@
         <w:tc>
           <w:tcPr>
             <w:tcW w:w="1520" w:type="dxa"/>
-            <w:shd w:val="clear" w:color="auto" w:fill="auto"/>
             <w:tcMar>
               <w:top w:w="100" w:type="dxa"/>
               <w:left w:w="100" w:type="dxa"/>
@@ -2430,7 +2393,6 @@
         <w:tc>
           <w:tcPr>
             <w:tcW w:w="3420" w:type="dxa"/>
-            <w:shd w:val="clear" w:color="auto" w:fill="auto"/>
             <w:tcMar>
               <w:top w:w="100" w:type="dxa"/>
               <w:left w:w="100" w:type="dxa"/>
@@ -2460,8 +2422,8 @@
           <w:noProof/>
         </w:rPr>
         <w:drawing>
-          <wp:inline distT="0" distB="0" distL="0" distR="0" wp14:anchorId="2656615B" wp14:editId="2C619DE2">
-            <wp:extent cx="4395173" cy="4386911"/>
+          <wp:inline distT="0" distB="0" distL="0" distR="0" wp14:anchorId="2656615B" wp14:editId="5F43EE37">
+            <wp:extent cx="4395173" cy="4386895"/>
             <wp:effectExtent l="0" t="0" r="0" b="0"/>
             <wp:docPr id="6" name="Picture 6"/>
             <wp:cNvGraphicFramePr>
@@ -2475,7 +2437,7 @@
                     <pic:cNvPicPr/>
                   </pic:nvPicPr>
                   <pic:blipFill>
-                    <a:blip r:embed="rId14">
+                    <a:blip r:embed="rId14" cstate="print">
                       <a:extLst>
                         <a:ext uri="{28A0092B-C50C-407E-A947-70E740481C1C}">
                           <a14:useLocalDpi xmlns:a14="http://schemas.microsoft.com/office/drawing/2010/main" val="0"/>
@@ -2489,7 +2451,7 @@
                   <pic:spPr>
                     <a:xfrm>
                       <a:off x="0" y="0"/>
-                      <a:ext cx="4395173" cy="4386911"/>
+                      <a:ext cx="4395173" cy="4386895"/>
                     </a:xfrm>
                     <a:prstGeom prst="rect">
                       <a:avLst/>
@@ -2607,7 +2569,6 @@
         <w:tc>
           <w:tcPr>
             <w:tcW w:w="1520" w:type="dxa"/>
-            <w:shd w:val="clear" w:color="auto" w:fill="auto"/>
             <w:tcMar>
               <w:top w:w="100" w:type="dxa"/>
               <w:left w:w="100" w:type="dxa"/>
@@ -2638,7 +2599,6 @@
         <w:tc>
           <w:tcPr>
             <w:tcW w:w="3420" w:type="dxa"/>
-            <w:shd w:val="clear" w:color="auto" w:fill="auto"/>
             <w:tcMar>
               <w:top w:w="100" w:type="dxa"/>
               <w:left w:w="100" w:type="dxa"/>
@@ -2679,7 +2639,6 @@
         <w:tc>
           <w:tcPr>
             <w:tcW w:w="1520" w:type="dxa"/>
-            <w:shd w:val="clear" w:color="auto" w:fill="auto"/>
             <w:tcMar>
               <w:top w:w="100" w:type="dxa"/>
               <w:left w:w="100" w:type="dxa"/>
@@ -2710,7 +2669,6 @@
         <w:tc>
           <w:tcPr>
             <w:tcW w:w="3420" w:type="dxa"/>
-            <w:shd w:val="clear" w:color="auto" w:fill="auto"/>
             <w:tcMar>
               <w:top w:w="100" w:type="dxa"/>
               <w:left w:w="100" w:type="dxa"/>
@@ -2733,7 +2691,6 @@
         <w:tc>
           <w:tcPr>
             <w:tcW w:w="1520" w:type="dxa"/>
-            <w:shd w:val="clear" w:color="auto" w:fill="auto"/>
             <w:tcMar>
               <w:top w:w="100" w:type="dxa"/>
               <w:left w:w="100" w:type="dxa"/>
@@ -2764,7 +2721,6 @@
         <w:tc>
           <w:tcPr>
             <w:tcW w:w="3420" w:type="dxa"/>
-            <w:shd w:val="clear" w:color="auto" w:fill="auto"/>
             <w:tcMar>
               <w:top w:w="100" w:type="dxa"/>
               <w:left w:w="100" w:type="dxa"/>
@@ -2794,9 +2750,9 @@
           <w:noProof/>
         </w:rPr>
         <w:drawing>
-          <wp:inline distT="0" distB="0" distL="0" distR="0" wp14:anchorId="333F9B5B" wp14:editId="4048A8D9">
-            <wp:extent cx="4312816" cy="4387175"/>
-            <wp:effectExtent l="0" t="0" r="5715" b="0"/>
+          <wp:inline distT="0" distB="0" distL="0" distR="0" wp14:anchorId="333F9B5B" wp14:editId="72486B29">
+            <wp:extent cx="4317536" cy="4392120"/>
+            <wp:effectExtent l="0" t="0" r="635" b="2540"/>
             <wp:docPr id="7" name="Picture 7"/>
             <wp:cNvGraphicFramePr>
               <a:graphicFrameLocks xmlns:a="http://schemas.openxmlformats.org/drawingml/2006/main" noChangeAspect="1"/>
@@ -2809,7 +2765,7 @@
                     <pic:cNvPicPr/>
                   </pic:nvPicPr>
                   <pic:blipFill>
-                    <a:blip r:embed="rId15">
+                    <a:blip r:embed="rId15" cstate="print">
                       <a:extLst>
                         <a:ext uri="{28A0092B-C50C-407E-A947-70E740481C1C}">
                           <a14:useLocalDpi xmlns:a14="http://schemas.microsoft.com/office/drawing/2010/main" val="0"/>
@@ -2823,7 +2779,7 @@
                   <pic:spPr>
                     <a:xfrm>
                       <a:off x="0" y="0"/>
-                      <a:ext cx="4317677" cy="4392120"/>
+                      <a:ext cx="4317536" cy="4392120"/>
                     </a:xfrm>
                     <a:prstGeom prst="rect">
                       <a:avLst/>
@@ -2963,7 +2919,6 @@
         <w:tc>
           <w:tcPr>
             <w:tcW w:w="1520" w:type="dxa"/>
-            <w:shd w:val="clear" w:color="auto" w:fill="auto"/>
             <w:tcMar>
               <w:top w:w="100" w:type="dxa"/>
               <w:left w:w="100" w:type="dxa"/>
@@ -2994,7 +2949,6 @@
         <w:tc>
           <w:tcPr>
             <w:tcW w:w="3420" w:type="dxa"/>
-            <w:shd w:val="clear" w:color="auto" w:fill="auto"/>
             <w:tcMar>
               <w:top w:w="100" w:type="dxa"/>
               <w:left w:w="100" w:type="dxa"/>
@@ -3026,7 +2980,6 @@
         <w:tc>
           <w:tcPr>
             <w:tcW w:w="1520" w:type="dxa"/>
-            <w:shd w:val="clear" w:color="auto" w:fill="auto"/>
             <w:tcMar>
               <w:top w:w="100" w:type="dxa"/>
               <w:left w:w="100" w:type="dxa"/>
@@ -3057,7 +3010,6 @@
         <w:tc>
           <w:tcPr>
             <w:tcW w:w="3420" w:type="dxa"/>
-            <w:shd w:val="clear" w:color="auto" w:fill="auto"/>
             <w:tcMar>
               <w:top w:w="100" w:type="dxa"/>
               <w:left w:w="100" w:type="dxa"/>
@@ -3092,7 +3044,6 @@
         <w:tc>
           <w:tcPr>
             <w:tcW w:w="1520" w:type="dxa"/>
-            <w:shd w:val="clear" w:color="auto" w:fill="auto"/>
             <w:tcMar>
               <w:top w:w="100" w:type="dxa"/>
               <w:left w:w="100" w:type="dxa"/>
@@ -3123,7 +3074,6 @@
         <w:tc>
           <w:tcPr>
             <w:tcW w:w="3420" w:type="dxa"/>
-            <w:shd w:val="clear" w:color="auto" w:fill="auto"/>
             <w:tcMar>
               <w:top w:w="100" w:type="dxa"/>
               <w:left w:w="100" w:type="dxa"/>
@@ -3153,9 +3103,9 @@
           <w:noProof/>
         </w:rPr>
         <w:drawing>
-          <wp:inline distT="0" distB="0" distL="0" distR="0" wp14:anchorId="23151CF3" wp14:editId="3C20BE18">
-            <wp:extent cx="4181011" cy="4387175"/>
-            <wp:effectExtent l="0" t="0" r="0" b="0"/>
+          <wp:inline distT="0" distB="0" distL="0" distR="0" wp14:anchorId="23151CF3" wp14:editId="686E8099">
+            <wp:extent cx="4193758" cy="4392671"/>
+            <wp:effectExtent l="0" t="0" r="0" b="1905"/>
             <wp:docPr id="8" name="Picture 8"/>
             <wp:cNvGraphicFramePr>
               <a:graphicFrameLocks xmlns:a="http://schemas.openxmlformats.org/drawingml/2006/main" noChangeAspect="1"/>
@@ -3168,7 +3118,7 @@
                     <pic:cNvPicPr/>
                   </pic:nvPicPr>
                   <pic:blipFill>
-                    <a:blip r:embed="rId16">
+                    <a:blip r:embed="rId16" cstate="print">
                       <a:extLst>
                         <a:ext uri="{28A0092B-C50C-407E-A947-70E740481C1C}">
                           <a14:useLocalDpi xmlns:a14="http://schemas.microsoft.com/office/drawing/2010/main" val="0"/>
@@ -3182,7 +3132,7 @@
                   <pic:spPr>
                     <a:xfrm>
                       <a:off x="0" y="0"/>
-                      <a:ext cx="4193758" cy="4400551"/>
+                      <a:ext cx="4193758" cy="4392671"/>
                     </a:xfrm>
                     <a:prstGeom prst="rect">
                       <a:avLst/>
@@ -3529,7 +3479,27 @@
           <w:vertAlign w:val="superscript"/>
           <w:lang w:val="en-US"/>
         </w:rPr>
-        <w:t>[3]</w:t>
+        <w:t>[</w:t>
+      </w:r>
+      <w:r>
+        <w:rPr>
+          <w:b/>
+          <w:bCs/>
+          <w:color w:val="0070C0"/>
+          <w:vertAlign w:val="superscript"/>
+          <w:lang w:val="en-US"/>
+        </w:rPr>
+        <w:t>2</w:t>
+      </w:r>
+      <w:r>
+        <w:rPr>
+          <w:b/>
+          <w:bCs/>
+          <w:color w:val="0070C0"/>
+          <w:vertAlign w:val="superscript"/>
+          <w:lang w:val="en-US"/>
+        </w:rPr>
+        <w:t>]</w:t>
       </w:r>
       <w:r>
         <w:rPr>
@@ -3941,7 +3911,6 @@
         <w:tc>
           <w:tcPr>
             <w:tcW w:w="1520" w:type="dxa"/>
-            <w:shd w:val="clear" w:color="auto" w:fill="auto"/>
             <w:tcMar>
               <w:top w:w="100" w:type="dxa"/>
               <w:left w:w="100" w:type="dxa"/>
@@ -3972,7 +3941,6 @@
         <w:tc>
           <w:tcPr>
             <w:tcW w:w="3420" w:type="dxa"/>
-            <w:shd w:val="clear" w:color="auto" w:fill="auto"/>
             <w:tcMar>
               <w:top w:w="100" w:type="dxa"/>
               <w:left w:w="100" w:type="dxa"/>
@@ -3995,7 +3963,6 @@
         <w:tc>
           <w:tcPr>
             <w:tcW w:w="1520" w:type="dxa"/>
-            <w:shd w:val="clear" w:color="auto" w:fill="auto"/>
             <w:tcMar>
               <w:top w:w="100" w:type="dxa"/>
               <w:left w:w="100" w:type="dxa"/>
@@ -4026,7 +3993,6 @@
         <w:tc>
           <w:tcPr>
             <w:tcW w:w="3420" w:type="dxa"/>
-            <w:shd w:val="clear" w:color="auto" w:fill="auto"/>
             <w:tcMar>
               <w:top w:w="100" w:type="dxa"/>
               <w:left w:w="100" w:type="dxa"/>
@@ -4058,7 +4024,6 @@
         <w:tc>
           <w:tcPr>
             <w:tcW w:w="1520" w:type="dxa"/>
-            <w:shd w:val="clear" w:color="auto" w:fill="auto"/>
             <w:tcMar>
               <w:top w:w="100" w:type="dxa"/>
               <w:left w:w="100" w:type="dxa"/>
@@ -4089,7 +4054,6 @@
         <w:tc>
           <w:tcPr>
             <w:tcW w:w="3420" w:type="dxa"/>
-            <w:shd w:val="clear" w:color="auto" w:fill="auto"/>
             <w:tcMar>
               <w:top w:w="100" w:type="dxa"/>
               <w:left w:w="100" w:type="dxa"/>
@@ -4119,9 +4083,9 @@
           <w:noProof/>
         </w:rPr>
         <w:drawing>
-          <wp:inline distT="0" distB="0" distL="0" distR="0" wp14:anchorId="4C043880" wp14:editId="58A6DCF9">
-            <wp:extent cx="3339080" cy="4418881"/>
-            <wp:effectExtent l="0" t="0" r="1270" b="1270"/>
+          <wp:inline distT="0" distB="0" distL="0" distR="0" wp14:anchorId="4C043880" wp14:editId="3E589C3C">
+            <wp:extent cx="3339080" cy="4413247"/>
+            <wp:effectExtent l="0" t="0" r="1270" b="0"/>
             <wp:docPr id="9" name="Picture 9"/>
             <wp:cNvGraphicFramePr>
               <a:graphicFrameLocks xmlns:a="http://schemas.openxmlformats.org/drawingml/2006/main" noChangeAspect="1"/>
@@ -4134,7 +4098,7 @@
                     <pic:cNvPicPr/>
                   </pic:nvPicPr>
                   <pic:blipFill>
-                    <a:blip r:embed="rId17">
+                    <a:blip r:embed="rId17" cstate="print">
                       <a:extLst>
                         <a:ext uri="{28A0092B-C50C-407E-A947-70E740481C1C}">
                           <a14:useLocalDpi xmlns:a14="http://schemas.microsoft.com/office/drawing/2010/main" val="0"/>
@@ -4148,7 +4112,7 @@
                   <pic:spPr>
                     <a:xfrm>
                       <a:off x="0" y="0"/>
-                      <a:ext cx="3339080" cy="4418881"/>
+                      <a:ext cx="3339080" cy="4413247"/>
                     </a:xfrm>
                     <a:prstGeom prst="rect">
                       <a:avLst/>
@@ -4263,7 +4227,7 @@
       </w:pPr>
       <w:r>
         <w:lastRenderedPageBreak/>
-        <w:t>Assess and Prioritize</w:t>
+        <w:t>Triage</w:t>
       </w:r>
     </w:p>
     <w:p/>
@@ -4289,7 +4253,6 @@
         <w:tc>
           <w:tcPr>
             <w:tcW w:w="1520" w:type="dxa"/>
-            <w:shd w:val="clear" w:color="auto" w:fill="auto"/>
             <w:tcMar>
               <w:top w:w="100" w:type="dxa"/>
               <w:left w:w="100" w:type="dxa"/>
@@ -4320,7 +4283,6 @@
         <w:tc>
           <w:tcPr>
             <w:tcW w:w="3420" w:type="dxa"/>
-            <w:shd w:val="clear" w:color="auto" w:fill="auto"/>
             <w:tcMar>
               <w:top w:w="100" w:type="dxa"/>
               <w:left w:w="100" w:type="dxa"/>
@@ -4343,7 +4305,6 @@
         <w:tc>
           <w:tcPr>
             <w:tcW w:w="1520" w:type="dxa"/>
-            <w:shd w:val="clear" w:color="auto" w:fill="auto"/>
             <w:tcMar>
               <w:top w:w="100" w:type="dxa"/>
               <w:left w:w="100" w:type="dxa"/>
@@ -4374,7 +4335,6 @@
         <w:tc>
           <w:tcPr>
             <w:tcW w:w="3420" w:type="dxa"/>
-            <w:shd w:val="clear" w:color="auto" w:fill="auto"/>
             <w:tcMar>
               <w:top w:w="100" w:type="dxa"/>
               <w:left w:w="100" w:type="dxa"/>
@@ -4388,7 +4348,13 @@
               <w:spacing w:line="240" w:lineRule="auto"/>
             </w:pPr>
             <w:r>
-              <w:t>Uncontrolled Threat</w:t>
+              <w:t>Triaged</w:t>
+            </w:r>
+            <w:r>
+              <w:t xml:space="preserve"> Threat</w:t>
+            </w:r>
+            <w:r>
+              <w:t xml:space="preserve"> Candidates</w:t>
             </w:r>
           </w:p>
           <w:p>
@@ -4396,6 +4362,9 @@
               <w:widowControl w:val="0"/>
               <w:spacing w:line="240" w:lineRule="auto"/>
             </w:pPr>
+            <w:r>
+              <w:t xml:space="preserve">Consolidated </w:t>
+            </w:r>
             <w:r>
               <w:t>Threat Report</w:t>
             </w:r>
@@ -4406,7 +4375,6 @@
         <w:tc>
           <w:tcPr>
             <w:tcW w:w="1520" w:type="dxa"/>
-            <w:shd w:val="clear" w:color="auto" w:fill="auto"/>
             <w:tcMar>
               <w:top w:w="100" w:type="dxa"/>
               <w:left w:w="100" w:type="dxa"/>
@@ -4437,7 +4405,6 @@
         <w:tc>
           <w:tcPr>
             <w:tcW w:w="3420" w:type="dxa"/>
-            <w:shd w:val="clear" w:color="auto" w:fill="auto"/>
             <w:tcMar>
               <w:top w:w="100" w:type="dxa"/>
               <w:left w:w="100" w:type="dxa"/>
@@ -4460,7 +4427,10 @@
               <w:spacing w:line="240" w:lineRule="auto"/>
             </w:pPr>
             <w:r>
-              <w:t>Risk SME</w:t>
+              <w:t>Development</w:t>
+            </w:r>
+            <w:r>
+              <w:t xml:space="preserve"> SME</w:t>
             </w:r>
           </w:p>
         </w:tc>
@@ -4476,8 +4446,8 @@
           <w:noProof/>
         </w:rPr>
         <w:drawing>
-          <wp:inline distT="0" distB="0" distL="0" distR="0" wp14:anchorId="5558B766" wp14:editId="16694E3F">
-            <wp:extent cx="5048143" cy="4387175"/>
+          <wp:inline distT="0" distB="0" distL="0" distR="0" wp14:anchorId="5558B766" wp14:editId="1B2A3C50">
+            <wp:extent cx="5099125" cy="4423136"/>
             <wp:effectExtent l="0" t="0" r="0" b="0"/>
             <wp:docPr id="10" name="Picture 10"/>
             <wp:cNvGraphicFramePr>
@@ -4491,7 +4461,7 @@
                     <pic:cNvPicPr/>
                   </pic:nvPicPr>
                   <pic:blipFill>
-                    <a:blip r:embed="rId18">
+                    <a:blip r:embed="rId18" cstate="print">
                       <a:extLst>
                         <a:ext uri="{28A0092B-C50C-407E-A947-70E740481C1C}">
                           <a14:useLocalDpi xmlns:a14="http://schemas.microsoft.com/office/drawing/2010/main" val="0"/>
@@ -4505,7 +4475,7 @@
                   <pic:spPr>
                     <a:xfrm>
                       <a:off x="0" y="0"/>
-                      <a:ext cx="5099125" cy="4431482"/>
+                      <a:ext cx="5099125" cy="4423136"/>
                     </a:xfrm>
                     <a:prstGeom prst="rect">
                       <a:avLst/>
@@ -4527,146 +4497,165 @@
       <w:pPr>
         <w:spacing w:after="240"/>
         <w:jc w:val="both"/>
-        <w:rPr>
-          <w:lang w:val="en-US"/>
-        </w:rPr>
-      </w:pPr>
-      <w:r>
-        <w:rPr>
-          <w:rFonts w:hint="eastAsia"/>
-          <w:lang w:val="en-US"/>
-        </w:rPr>
-        <w:t xml:space="preserve">The Security SME will take </w:t>
-      </w:r>
-      <w:r>
-        <w:rPr>
-          <w:lang w:val="en-US"/>
-        </w:rPr>
-        <w:t>each</w:t>
-      </w:r>
-      <w:r>
-        <w:rPr>
-          <w:rFonts w:hint="eastAsia"/>
-          <w:lang w:val="en-US"/>
-        </w:rPr>
+      </w:pPr>
+      <w:r>
+        <w:t xml:space="preserve">The </w:t>
+      </w:r>
+      <w:r>
+        <w:rPr>
+          <w:b/>
+          <w:bCs/>
+        </w:rPr>
+        <w:t>Security SME</w:t>
+      </w:r>
+      <w:r>
+        <w:t xml:space="preserve"> and </w:t>
+      </w:r>
+      <w:r>
+        <w:rPr>
+          <w:b/>
+          <w:bCs/>
+        </w:rPr>
+        <w:t>Development SME</w:t>
+      </w:r>
+      <w:r>
+        <w:t xml:space="preserve"> review the </w:t>
+      </w:r>
+      <w:r>
+        <w:rPr>
+          <w:b/>
+          <w:bCs/>
+        </w:rPr>
+        <w:t>Threat Candidates</w:t>
+      </w:r>
+      <w:r>
+        <w:t xml:space="preserve"> to </w:t>
+      </w:r>
+      <w:r>
+        <w:t>identify</w:t>
+      </w:r>
+      <w:r>
+        <w:t xml:space="preserve"> any </w:t>
+      </w:r>
+      <w:r>
+        <w:t>issues</w:t>
+      </w:r>
+      <w:r>
         <w:t xml:space="preserve"> </w:t>
       </w:r>
       <w:r>
-        <w:rPr>
-          <w:b/>
-          <w:bCs/>
-          <w:lang w:val="en-US"/>
-        </w:rPr>
-        <w:t xml:space="preserve">Threat Candidate </w:t>
-      </w:r>
-      <w:r>
-        <w:rPr>
-          <w:rFonts w:hint="eastAsia"/>
-          <w:lang w:val="en-US"/>
-        </w:rPr>
-        <w:t xml:space="preserve">and apply the </w:t>
-      </w:r>
-      <w:r>
-        <w:rPr>
-          <w:b/>
-          <w:bCs/>
-          <w:lang w:val="en-US"/>
-        </w:rPr>
-        <w:t>Threat Prioritization Plan</w:t>
-      </w:r>
-      <w:r>
-        <w:rPr>
-          <w:rFonts w:hint="eastAsia"/>
-          <w:lang w:val="en-US"/>
-        </w:rPr>
-        <w:t xml:space="preserve">. The </w:t>
-      </w:r>
-      <w:r>
-        <w:rPr>
-          <w:b/>
-          <w:bCs/>
-          <w:lang w:val="en-US"/>
-        </w:rPr>
-        <w:t xml:space="preserve">Threat Candidate’s </w:t>
-      </w:r>
-      <w:r>
-        <w:rPr>
-          <w:rFonts w:hint="eastAsia"/>
-          <w:lang w:val="en-US"/>
-        </w:rPr>
-        <w:t xml:space="preserve">rank and risk will be assigned by the Security SME and Risk SME respectively. A </w:t>
-      </w:r>
-      <w:r>
-        <w:rPr>
-          <w:b/>
-          <w:bCs/>
-          <w:lang w:val="en-US"/>
-        </w:rPr>
-        <w:t xml:space="preserve">Threat Report </w:t>
-      </w:r>
-      <w:r>
-        <w:rPr>
-          <w:rFonts w:hint="eastAsia"/>
-          <w:lang w:val="en-US"/>
-        </w:rPr>
-        <w:t xml:space="preserve">documenting the findings </w:t>
-      </w:r>
-      <w:r>
-        <w:rPr>
-          <w:lang w:val="en-US"/>
-        </w:rPr>
-        <w:t>will</w:t>
-      </w:r>
-      <w:r>
-        <w:rPr>
-          <w:rFonts w:hint="eastAsia"/>
-          <w:lang w:val="en-US"/>
-        </w:rPr>
-        <w:t xml:space="preserve"> be generated.</w:t>
-      </w:r>
-      <w:r>
-        <w:rPr>
-          <w:lang w:val="en-US"/>
+        <w:t>needing</w:t>
+      </w:r>
+      <w:r>
+        <w:t xml:space="preserve"> further investigat</w:t>
+      </w:r>
+      <w:r>
+        <w:t>ion</w:t>
+      </w:r>
+      <w:r>
+        <w:t xml:space="preserve">. </w:t>
+      </w:r>
+      <w:r>
+        <w:t xml:space="preserve">The </w:t>
+      </w:r>
+      <w:r>
+        <w:rPr>
+          <w:b/>
+          <w:bCs/>
+        </w:rPr>
+        <w:t>Triaged Threat Candidates</w:t>
+      </w:r>
+      <w:r>
+        <w:t xml:space="preserve"> are sent to the threat prioritization process </w:t>
+      </w:r>
+      <w:r>
+        <w:rPr>
+          <w:b/>
+          <w:bCs/>
+          <w:color w:val="0070C0"/>
+          <w:vertAlign w:val="superscript"/>
+        </w:rPr>
+        <w:t>[</w:t>
+      </w:r>
+      <w:r>
+        <w:rPr>
+          <w:b/>
+          <w:bCs/>
+          <w:color w:val="0070C0"/>
+          <w:vertAlign w:val="superscript"/>
+        </w:rPr>
+        <w:t>1</w:t>
+      </w:r>
+      <w:r>
+        <w:rPr>
+          <w:b/>
+          <w:bCs/>
+          <w:color w:val="0070C0"/>
+          <w:vertAlign w:val="superscript"/>
+        </w:rPr>
+        <w:t>]</w:t>
+      </w:r>
+      <w:r>
+        <w:t>.</w:t>
+      </w:r>
+      <w:r>
+        <w:t xml:space="preserve"> A </w:t>
+      </w:r>
+      <w:r>
+        <w:rPr>
+          <w:b/>
+          <w:bCs/>
+        </w:rPr>
+        <w:t>Consolidated Threat</w:t>
+      </w:r>
+      <w:r>
+        <w:rPr>
+          <w:b/>
+          <w:bCs/>
         </w:rPr>
         <w:t xml:space="preserve"> </w:t>
       </w:r>
       <w:r>
         <w:rPr>
-          <w:rFonts w:hint="eastAsia"/>
-          <w:lang w:val="en-US"/>
-        </w:rPr>
-        <w:t xml:space="preserve">If the threat is determined to be controlled a </w:t>
-      </w:r>
-      <w:r>
-        <w:rPr>
-          <w:b/>
-          <w:bCs/>
-          <w:lang w:val="en-US"/>
-        </w:rPr>
-        <w:t xml:space="preserve">Dismissed Threat Candidate </w:t>
-      </w:r>
-      <w:r>
-        <w:rPr>
-          <w:rFonts w:hint="eastAsia"/>
-          <w:lang w:val="en-US"/>
-        </w:rPr>
-        <w:t xml:space="preserve">notification will be generated. If the threat is determined to be uncontrolled, an </w:t>
-      </w:r>
-      <w:r>
-        <w:rPr>
-          <w:b/>
-          <w:bCs/>
-          <w:lang w:val="en-US"/>
-        </w:rPr>
-        <w:t xml:space="preserve">Uncontrolled Threat </w:t>
-      </w:r>
-      <w:r>
-        <w:rPr>
-          <w:rFonts w:hint="eastAsia"/>
-          <w:lang w:val="en-US"/>
-        </w:rPr>
-        <w:t xml:space="preserve">will be generated. </w:t>
-      </w:r>
+          <w:b/>
+          <w:bCs/>
+        </w:rPr>
+        <w:t>R</w:t>
+      </w:r>
+      <w:r>
+        <w:rPr>
+          <w:b/>
+          <w:bCs/>
+        </w:rPr>
+        <w:t>eport</w:t>
+      </w:r>
+      <w:r>
+        <w:t xml:space="preserve"> will be generated.</w:t>
+      </w:r>
+    </w:p>
+    <w:p>
+      <w:pPr>
+        <w:ind w:left="720" w:hanging="720"/>
+        <w:jc w:val="both"/>
+      </w:pPr>
+      <w:r>
+        <w:rPr>
+          <w:b/>
+          <w:bCs/>
+          <w:color w:val="0070C0"/>
+        </w:rPr>
+        <w:t>Note:</w:t>
+      </w:r>
+      <w:r>
+        <w:tab/>
+        <w:t>Depending on the nature of the identified issue, it may be entered directly into the issue tracking system.</w:t>
+      </w:r>
+    </w:p>
+    <w:p>
+      <w:pPr>
+        <w:ind w:left="720" w:hanging="720"/>
+        <w:jc w:val="both"/>
+      </w:pPr>
     </w:p>
     <w:p>
       <w:pPr>
@@ -4771,52 +4760,6 @@
       <w:r>
         <w:rPr>
           <w:bCs/>
-        </w:rPr>
-        <w:t>)</w:t>
-      </w:r>
-    </w:p>
-    <w:p>
-      <w:pPr>
-        <w:numPr>
-          <w:ilvl w:val="0"/>
-          <w:numId w:val="1"/>
-        </w:numPr>
-        <w:tabs>
-          <w:tab w:val="clear" w:pos="822"/>
-        </w:tabs>
-        <w:ind w:left="360"/>
-        <w:rPr>
-          <w:b/>
-        </w:rPr>
-      </w:pPr>
-      <w:r>
-        <w:rPr>
-          <w:b/>
-          <w:bCs/>
-        </w:rPr>
-        <w:t>Threat Report</w:t>
-      </w:r>
-      <w:r>
-        <w:rPr>
-          <w:b/>
-        </w:rPr>
-        <w:t xml:space="preserve"> </w:t>
-      </w:r>
-      <w:r>
-        <w:rPr>
-          <w:b/>
-        </w:rPr>
-        <w:t>(</w:t>
-      </w:r>
-      <w:r>
-        <w:rPr>
-          <w:bCs/>
-        </w:rPr>
-        <w:t>AVCDL secondary document</w:t>
-      </w:r>
-      <w:r>
-        <w:rPr>
-          <w:b/>
         </w:rPr>
         <w:t>)</w:t>
       </w:r>
@@ -5054,7 +4997,7 @@
 </file>
 
 <file path=word/endnotes.xml><?xml version="1.0" encoding="utf-8"?>
-<w:endnotes xmlns:wpc="http://schemas.microsoft.com/office/word/2010/wordprocessingCanvas" xmlns:cx="http://schemas.microsoft.com/office/drawing/2014/chartex" xmlns:cx1="http://schemas.microsoft.com/office/drawing/2015/9/8/chartex" xmlns:cx2="http://schemas.microsoft.com/office/drawing/2015/10/21/chartex" xmlns:cx3="http://schemas.microsoft.com/office/drawing/2016/5/9/chartex" xmlns:cx4="http://schemas.microsoft.com/office/drawing/2016/5/10/chartex" xmlns:cx5="http://schemas.microsoft.com/office/drawing/2016/5/11/chartex" xmlns:cx6="http://schemas.microsoft.com/office/drawing/2016/5/12/chartex" xmlns:cx7="http://schemas.microsoft.com/office/drawing/2016/5/13/chartex" xmlns:cx8="http://schemas.microsoft.com/office/drawing/2016/5/14/chartex" xmlns:mc="http://schemas.openxmlformats.org/markup-compatibility/2006" xmlns:aink="http://schemas.microsoft.com/office/drawing/2016/ink" xmlns:am3d="http://schemas.microsoft.com/office/drawing/2017/model3d" xmlns:o="urn:schemas-microsoft-com:office:office" xmlns:oel="http://schemas.microsoft.com/office/2019/extlst" xmlns:r="http://schemas.openxmlformats.org/officeDocument/2006/relationships" xmlns:m="http://schemas.openxmlformats.org/officeDocument/2006/math" xmlns:v="urn:schemas-microsoft-com:vml" xmlns:wp14="http://schemas.microsoft.com/office/word/2010/wordprocessingDrawing" xmlns:wp="http://schemas.openxmlformats.org/drawingml/2006/wordprocessingDrawing" xmlns:w10="urn:schemas-microsoft-com:office:word" xmlns:w="http://schemas.openxmlformats.org/wordprocessingml/2006/main" xmlns:w14="http://schemas.microsoft.com/office/word/2010/wordml" xmlns:w15="http://schemas.microsoft.com/office/word/2012/wordml" xmlns:w16cex="http://schemas.microsoft.com/office/word/2018/wordml/cex" xmlns:w16cid="http://schemas.microsoft.com/office/word/2016/wordml/cid" xmlns:w16="http://schemas.microsoft.com/office/word/2018/wordml" xmlns:w16sdtdh="http://schemas.microsoft.com/office/word/2020/wordml/sdtdatahash" xmlns:w16se="http://schemas.microsoft.com/office/word/2015/wordml/symex" xmlns:wpg="http://schemas.microsoft.com/office/word/2010/wordprocessingGroup" xmlns:wpi="http://schemas.microsoft.com/office/word/2010/wordprocessingInk" xmlns:wne="http://schemas.microsoft.com/office/word/2006/wordml" xmlns:wps="http://schemas.microsoft.com/office/word/2010/wordprocessingShape" mc:Ignorable="w14 w15 w16se w16cid w16 w16cex w16sdtdh wp14">
+<w:endnotes xmlns:wpc="http://schemas.microsoft.com/office/word/2010/wordprocessingCanvas" xmlns:cx="http://schemas.microsoft.com/office/drawing/2014/chartex" xmlns:cx1="http://schemas.microsoft.com/office/drawing/2015/9/8/chartex" xmlns:cx2="http://schemas.microsoft.com/office/drawing/2015/10/21/chartex" xmlns:cx3="http://schemas.microsoft.com/office/drawing/2016/5/9/chartex" xmlns:cx4="http://schemas.microsoft.com/office/drawing/2016/5/10/chartex" xmlns:cx5="http://schemas.microsoft.com/office/drawing/2016/5/11/chartex" xmlns:cx6="http://schemas.microsoft.com/office/drawing/2016/5/12/chartex" xmlns:cx7="http://schemas.microsoft.com/office/drawing/2016/5/13/chartex" xmlns:cx8="http://schemas.microsoft.com/office/drawing/2016/5/14/chartex" xmlns:mc="http://schemas.openxmlformats.org/markup-compatibility/2006" xmlns:aink="http://schemas.microsoft.com/office/drawing/2016/ink" xmlns:am3d="http://schemas.microsoft.com/office/drawing/2017/model3d" xmlns:o="urn:schemas-microsoft-com:office:office" xmlns:oel="http://schemas.microsoft.com/office/2019/extlst" xmlns:r="http://schemas.openxmlformats.org/officeDocument/2006/relationships" xmlns:m="http://schemas.openxmlformats.org/officeDocument/2006/math" xmlns:v="urn:schemas-microsoft-com:vml" xmlns:wp14="http://schemas.microsoft.com/office/word/2010/wordprocessingDrawing" xmlns:wp="http://schemas.openxmlformats.org/drawingml/2006/wordprocessingDrawing" xmlns:w10="urn:schemas-microsoft-com:office:word" xmlns:w="http://schemas.openxmlformats.org/wordprocessingml/2006/main" xmlns:w14="http://schemas.microsoft.com/office/word/2010/wordml" xmlns:w15="http://schemas.microsoft.com/office/word/2012/wordml" xmlns:w16cex="http://schemas.microsoft.com/office/word/2018/wordml/cex" xmlns:w16cid="http://schemas.microsoft.com/office/word/2016/wordml/cid" xmlns:w16="http://schemas.microsoft.com/office/word/2018/wordml" xmlns:w16du="http://schemas.microsoft.com/office/word/2023/wordml/word16du" xmlns:w16sdtdh="http://schemas.microsoft.com/office/word/2020/wordml/sdtdatahash" xmlns:w16sdtfl="http://schemas.microsoft.com/office/word/2024/wordml/sdtformatlock" xmlns:w16se="http://schemas.microsoft.com/office/word/2015/wordml/symex" xmlns:wpg="http://schemas.microsoft.com/office/word/2010/wordprocessingGroup" xmlns:wpi="http://schemas.microsoft.com/office/word/2010/wordprocessingInk" xmlns:wne="http://schemas.microsoft.com/office/word/2006/wordml" xmlns:wps="http://schemas.microsoft.com/office/word/2010/wordprocessingShape" mc:Ignorable="w14 w15 w16se w16cid w16 w16cex w16sdtdh w16sdtfl w16du wp14">
   <w:endnote w:type="separator" w:id="-1">
     <w:p>
       <w:pPr>
@@ -5079,7 +5022,7 @@
 </file>
 
 <file path=word/footer1.xml><?xml version="1.0" encoding="utf-8"?>
-<w:ftr xmlns:wpc="http://schemas.microsoft.com/office/word/2010/wordprocessingCanvas" xmlns:cx="http://schemas.microsoft.com/office/drawing/2014/chartex" xmlns:cx1="http://schemas.microsoft.com/office/drawing/2015/9/8/chartex" xmlns:cx2="http://schemas.microsoft.com/office/drawing/2015/10/21/chartex" xmlns:cx3="http://schemas.microsoft.com/office/drawing/2016/5/9/chartex" xmlns:cx4="http://schemas.microsoft.com/office/drawing/2016/5/10/chartex" xmlns:cx5="http://schemas.microsoft.com/office/drawing/2016/5/11/chartex" xmlns:cx6="http://schemas.microsoft.com/office/drawing/2016/5/12/chartex" xmlns:cx7="http://schemas.microsoft.com/office/drawing/2016/5/13/chartex" xmlns:cx8="http://schemas.microsoft.com/office/drawing/2016/5/14/chartex" xmlns:mc="http://schemas.openxmlformats.org/markup-compatibility/2006" xmlns:aink="http://schemas.microsoft.com/office/drawing/2016/ink" xmlns:am3d="http://schemas.microsoft.com/office/drawing/2017/model3d" xmlns:o="urn:schemas-microsoft-com:office:office" xmlns:oel="http://schemas.microsoft.com/office/2019/extlst" xmlns:r="http://schemas.openxmlformats.org/officeDocument/2006/relationships" xmlns:m="http://schemas.openxmlformats.org/officeDocument/2006/math" xmlns:v="urn:schemas-microsoft-com:vml" xmlns:wp14="http://schemas.microsoft.com/office/word/2010/wordprocessingDrawing" xmlns:wp="http://schemas.openxmlformats.org/drawingml/2006/wordprocessingDrawing" xmlns:w10="urn:schemas-microsoft-com:office:word" xmlns:w="http://schemas.openxmlformats.org/wordprocessingml/2006/main" xmlns:w14="http://schemas.microsoft.com/office/word/2010/wordml" xmlns:w15="http://schemas.microsoft.com/office/word/2012/wordml" xmlns:w16cex="http://schemas.microsoft.com/office/word/2018/wordml/cex" xmlns:w16cid="http://schemas.microsoft.com/office/word/2016/wordml/cid" xmlns:w16="http://schemas.microsoft.com/office/word/2018/wordml" xmlns:w16sdtdh="http://schemas.microsoft.com/office/word/2020/wordml/sdtdatahash" xmlns:w16se="http://schemas.microsoft.com/office/word/2015/wordml/symex" xmlns:wpg="http://schemas.microsoft.com/office/word/2010/wordprocessingGroup" xmlns:wpi="http://schemas.microsoft.com/office/word/2010/wordprocessingInk" xmlns:wne="http://schemas.microsoft.com/office/word/2006/wordml" xmlns:wps="http://schemas.microsoft.com/office/word/2010/wordprocessingShape" mc:Ignorable="w14 w15 w16se w16cid w16 w16cex w16sdtdh wp14">
+<w:ftr xmlns:wpc="http://schemas.microsoft.com/office/word/2010/wordprocessingCanvas" xmlns:cx="http://schemas.microsoft.com/office/drawing/2014/chartex" xmlns:cx1="http://schemas.microsoft.com/office/drawing/2015/9/8/chartex" xmlns:cx2="http://schemas.microsoft.com/office/drawing/2015/10/21/chartex" xmlns:cx3="http://schemas.microsoft.com/office/drawing/2016/5/9/chartex" xmlns:cx4="http://schemas.microsoft.com/office/drawing/2016/5/10/chartex" xmlns:cx5="http://schemas.microsoft.com/office/drawing/2016/5/11/chartex" xmlns:cx6="http://schemas.microsoft.com/office/drawing/2016/5/12/chartex" xmlns:cx7="http://schemas.microsoft.com/office/drawing/2016/5/13/chartex" xmlns:cx8="http://schemas.microsoft.com/office/drawing/2016/5/14/chartex" xmlns:mc="http://schemas.openxmlformats.org/markup-compatibility/2006" xmlns:aink="http://schemas.microsoft.com/office/drawing/2016/ink" xmlns:am3d="http://schemas.microsoft.com/office/drawing/2017/model3d" xmlns:o="urn:schemas-microsoft-com:office:office" xmlns:oel="http://schemas.microsoft.com/office/2019/extlst" xmlns:r="http://schemas.openxmlformats.org/officeDocument/2006/relationships" xmlns:m="http://schemas.openxmlformats.org/officeDocument/2006/math" xmlns:v="urn:schemas-microsoft-com:vml" xmlns:wp14="http://schemas.microsoft.com/office/word/2010/wordprocessingDrawing" xmlns:wp="http://schemas.openxmlformats.org/drawingml/2006/wordprocessingDrawing" xmlns:w10="urn:schemas-microsoft-com:office:word" xmlns:w="http://schemas.openxmlformats.org/wordprocessingml/2006/main" xmlns:w14="http://schemas.microsoft.com/office/word/2010/wordml" xmlns:w15="http://schemas.microsoft.com/office/word/2012/wordml" xmlns:w16cex="http://schemas.microsoft.com/office/word/2018/wordml/cex" xmlns:w16cid="http://schemas.microsoft.com/office/word/2016/wordml/cid" xmlns:w16="http://schemas.microsoft.com/office/word/2018/wordml" xmlns:w16du="http://schemas.microsoft.com/office/word/2023/wordml/word16du" xmlns:w16sdtdh="http://schemas.microsoft.com/office/word/2020/wordml/sdtdatahash" xmlns:w16sdtfl="http://schemas.microsoft.com/office/word/2024/wordml/sdtformatlock" xmlns:w16se="http://schemas.microsoft.com/office/word/2015/wordml/symex" xmlns:wpg="http://schemas.microsoft.com/office/word/2010/wordprocessingGroup" xmlns:wpi="http://schemas.microsoft.com/office/word/2010/wordprocessingInk" xmlns:wne="http://schemas.microsoft.com/office/word/2006/wordml" xmlns:wps="http://schemas.microsoft.com/office/word/2010/wordprocessingShape" mc:Ignorable="w14 w15 w16se w16cid w16 w16cex w16sdtdh w16sdtfl w16du wp14">
   <w:sdt>
     <w:sdtPr>
       <w:rPr>
@@ -5144,7 +5087,7 @@
 </file>
 
 <file path=word/footer2.xml><?xml version="1.0" encoding="utf-8"?>
-<w:ftr xmlns:wpc="http://schemas.microsoft.com/office/word/2010/wordprocessingCanvas" xmlns:cx="http://schemas.microsoft.com/office/drawing/2014/chartex" xmlns:cx1="http://schemas.microsoft.com/office/drawing/2015/9/8/chartex" xmlns:cx2="http://schemas.microsoft.com/office/drawing/2015/10/21/chartex" xmlns:cx3="http://schemas.microsoft.com/office/drawing/2016/5/9/chartex" xmlns:cx4="http://schemas.microsoft.com/office/drawing/2016/5/10/chartex" xmlns:cx5="http://schemas.microsoft.com/office/drawing/2016/5/11/chartex" xmlns:cx6="http://schemas.microsoft.com/office/drawing/2016/5/12/chartex" xmlns:cx7="http://schemas.microsoft.com/office/drawing/2016/5/13/chartex" xmlns:cx8="http://schemas.microsoft.com/office/drawing/2016/5/14/chartex" xmlns:mc="http://schemas.openxmlformats.org/markup-compatibility/2006" xmlns:aink="http://schemas.microsoft.com/office/drawing/2016/ink" xmlns:am3d="http://schemas.microsoft.com/office/drawing/2017/model3d" xmlns:o="urn:schemas-microsoft-com:office:office" xmlns:oel="http://schemas.microsoft.com/office/2019/extlst" xmlns:r="http://schemas.openxmlformats.org/officeDocument/2006/relationships" xmlns:m="http://schemas.openxmlformats.org/officeDocument/2006/math" xmlns:v="urn:schemas-microsoft-com:vml" xmlns:wp14="http://schemas.microsoft.com/office/word/2010/wordprocessingDrawing" xmlns:wp="http://schemas.openxmlformats.org/drawingml/2006/wordprocessingDrawing" xmlns:w10="urn:schemas-microsoft-com:office:word" xmlns:w="http://schemas.openxmlformats.org/wordprocessingml/2006/main" xmlns:w14="http://schemas.microsoft.com/office/word/2010/wordml" xmlns:w15="http://schemas.microsoft.com/office/word/2012/wordml" xmlns:w16cex="http://schemas.microsoft.com/office/word/2018/wordml/cex" xmlns:w16cid="http://schemas.microsoft.com/office/word/2016/wordml/cid" xmlns:w16="http://schemas.microsoft.com/office/word/2018/wordml" xmlns:w16sdtdh="http://schemas.microsoft.com/office/word/2020/wordml/sdtdatahash" xmlns:w16se="http://schemas.microsoft.com/office/word/2015/wordml/symex" xmlns:wpg="http://schemas.microsoft.com/office/word/2010/wordprocessingGroup" xmlns:wpi="http://schemas.microsoft.com/office/word/2010/wordprocessingInk" xmlns:wne="http://schemas.microsoft.com/office/word/2006/wordml" xmlns:wps="http://schemas.microsoft.com/office/word/2010/wordprocessingShape" mc:Ignorable="w14 w15 w16se w16cid w16 w16cex w16sdtdh wp14">
+<w:ftr xmlns:wpc="http://schemas.microsoft.com/office/word/2010/wordprocessingCanvas" xmlns:cx="http://schemas.microsoft.com/office/drawing/2014/chartex" xmlns:cx1="http://schemas.microsoft.com/office/drawing/2015/9/8/chartex" xmlns:cx2="http://schemas.microsoft.com/office/drawing/2015/10/21/chartex" xmlns:cx3="http://schemas.microsoft.com/office/drawing/2016/5/9/chartex" xmlns:cx4="http://schemas.microsoft.com/office/drawing/2016/5/10/chartex" xmlns:cx5="http://schemas.microsoft.com/office/drawing/2016/5/11/chartex" xmlns:cx6="http://schemas.microsoft.com/office/drawing/2016/5/12/chartex" xmlns:cx7="http://schemas.microsoft.com/office/drawing/2016/5/13/chartex" xmlns:cx8="http://schemas.microsoft.com/office/drawing/2016/5/14/chartex" xmlns:mc="http://schemas.openxmlformats.org/markup-compatibility/2006" xmlns:aink="http://schemas.microsoft.com/office/drawing/2016/ink" xmlns:am3d="http://schemas.microsoft.com/office/drawing/2017/model3d" xmlns:o="urn:schemas-microsoft-com:office:office" xmlns:oel="http://schemas.microsoft.com/office/2019/extlst" xmlns:r="http://schemas.openxmlformats.org/officeDocument/2006/relationships" xmlns:m="http://schemas.openxmlformats.org/officeDocument/2006/math" xmlns:v="urn:schemas-microsoft-com:vml" xmlns:wp14="http://schemas.microsoft.com/office/word/2010/wordprocessingDrawing" xmlns:wp="http://schemas.openxmlformats.org/drawingml/2006/wordprocessingDrawing" xmlns:w10="urn:schemas-microsoft-com:office:word" xmlns:w="http://schemas.openxmlformats.org/wordprocessingml/2006/main" xmlns:w14="http://schemas.microsoft.com/office/word/2010/wordml" xmlns:w15="http://schemas.microsoft.com/office/word/2012/wordml" xmlns:w16cex="http://schemas.microsoft.com/office/word/2018/wordml/cex" xmlns:w16cid="http://schemas.microsoft.com/office/word/2016/wordml/cid" xmlns:w16="http://schemas.microsoft.com/office/word/2018/wordml" xmlns:w16du="http://schemas.microsoft.com/office/word/2023/wordml/word16du" xmlns:w16sdtdh="http://schemas.microsoft.com/office/word/2020/wordml/sdtdatahash" xmlns:w16sdtfl="http://schemas.microsoft.com/office/word/2024/wordml/sdtformatlock" xmlns:w16se="http://schemas.microsoft.com/office/word/2015/wordml/symex" xmlns:wpg="http://schemas.microsoft.com/office/word/2010/wordprocessingGroup" xmlns:wpi="http://schemas.microsoft.com/office/word/2010/wordprocessingInk" xmlns:wne="http://schemas.microsoft.com/office/word/2006/wordml" xmlns:wps="http://schemas.microsoft.com/office/word/2010/wordprocessingShape" mc:Ignorable="w14 w15 w16se w16cid w16 w16cex w16sdtdh w16sdtfl w16du wp14">
   <w:sdt>
     <w:sdtPr>
       <w:rPr>
@@ -5209,7 +5152,7 @@
 </file>
 
 <file path=word/footnotes.xml><?xml version="1.0" encoding="utf-8"?>
-<w:footnotes xmlns:wpc="http://schemas.microsoft.com/office/word/2010/wordprocessingCanvas" xmlns:cx="http://schemas.microsoft.com/office/drawing/2014/chartex" xmlns:cx1="http://schemas.microsoft.com/office/drawing/2015/9/8/chartex" xmlns:cx2="http://schemas.microsoft.com/office/drawing/2015/10/21/chartex" xmlns:cx3="http://schemas.microsoft.com/office/drawing/2016/5/9/chartex" xmlns:cx4="http://schemas.microsoft.com/office/drawing/2016/5/10/chartex" xmlns:cx5="http://schemas.microsoft.com/office/drawing/2016/5/11/chartex" xmlns:cx6="http://schemas.microsoft.com/office/drawing/2016/5/12/chartex" xmlns:cx7="http://schemas.microsoft.com/office/drawing/2016/5/13/chartex" xmlns:cx8="http://schemas.microsoft.com/office/drawing/2016/5/14/chartex" xmlns:mc="http://schemas.openxmlformats.org/markup-compatibility/2006" xmlns:aink="http://schemas.microsoft.com/office/drawing/2016/ink" xmlns:am3d="http://schemas.microsoft.com/office/drawing/2017/model3d" xmlns:o="urn:schemas-microsoft-com:office:office" xmlns:oel="http://schemas.microsoft.com/office/2019/extlst" xmlns:r="http://schemas.openxmlformats.org/officeDocument/2006/relationships" xmlns:m="http://schemas.openxmlformats.org/officeDocument/2006/math" xmlns:v="urn:schemas-microsoft-com:vml" xmlns:wp14="http://schemas.microsoft.com/office/word/2010/wordprocessingDrawing" xmlns:wp="http://schemas.openxmlformats.org/drawingml/2006/wordprocessingDrawing" xmlns:w10="urn:schemas-microsoft-com:office:word" xmlns:w="http://schemas.openxmlformats.org/wordprocessingml/2006/main" xmlns:w14="http://schemas.microsoft.com/office/word/2010/wordml" xmlns:w15="http://schemas.microsoft.com/office/word/2012/wordml" xmlns:w16cex="http://schemas.microsoft.com/office/word/2018/wordml/cex" xmlns:w16cid="http://schemas.microsoft.com/office/word/2016/wordml/cid" xmlns:w16="http://schemas.microsoft.com/office/word/2018/wordml" xmlns:w16sdtdh="http://schemas.microsoft.com/office/word/2020/wordml/sdtdatahash" xmlns:w16se="http://schemas.microsoft.com/office/word/2015/wordml/symex" xmlns:wpg="http://schemas.microsoft.com/office/word/2010/wordprocessingGroup" xmlns:wpi="http://schemas.microsoft.com/office/word/2010/wordprocessingInk" xmlns:wne="http://schemas.microsoft.com/office/word/2006/wordml" xmlns:wps="http://schemas.microsoft.com/office/word/2010/wordprocessingShape" mc:Ignorable="w14 w15 w16se w16cid w16 w16cex w16sdtdh wp14">
+<w:footnotes xmlns:wpc="http://schemas.microsoft.com/office/word/2010/wordprocessingCanvas" xmlns:cx="http://schemas.microsoft.com/office/drawing/2014/chartex" xmlns:cx1="http://schemas.microsoft.com/office/drawing/2015/9/8/chartex" xmlns:cx2="http://schemas.microsoft.com/office/drawing/2015/10/21/chartex" xmlns:cx3="http://schemas.microsoft.com/office/drawing/2016/5/9/chartex" xmlns:cx4="http://schemas.microsoft.com/office/drawing/2016/5/10/chartex" xmlns:cx5="http://schemas.microsoft.com/office/drawing/2016/5/11/chartex" xmlns:cx6="http://schemas.microsoft.com/office/drawing/2016/5/12/chartex" xmlns:cx7="http://schemas.microsoft.com/office/drawing/2016/5/13/chartex" xmlns:cx8="http://schemas.microsoft.com/office/drawing/2016/5/14/chartex" xmlns:mc="http://schemas.openxmlformats.org/markup-compatibility/2006" xmlns:aink="http://schemas.microsoft.com/office/drawing/2016/ink" xmlns:am3d="http://schemas.microsoft.com/office/drawing/2017/model3d" xmlns:o="urn:schemas-microsoft-com:office:office" xmlns:oel="http://schemas.microsoft.com/office/2019/extlst" xmlns:r="http://schemas.openxmlformats.org/officeDocument/2006/relationships" xmlns:m="http://schemas.openxmlformats.org/officeDocument/2006/math" xmlns:v="urn:schemas-microsoft-com:vml" xmlns:wp14="http://schemas.microsoft.com/office/word/2010/wordprocessingDrawing" xmlns:wp="http://schemas.openxmlformats.org/drawingml/2006/wordprocessingDrawing" xmlns:w10="urn:schemas-microsoft-com:office:word" xmlns:w="http://schemas.openxmlformats.org/wordprocessingml/2006/main" xmlns:w14="http://schemas.microsoft.com/office/word/2010/wordml" xmlns:w15="http://schemas.microsoft.com/office/word/2012/wordml" xmlns:w16cex="http://schemas.microsoft.com/office/word/2018/wordml/cex" xmlns:w16cid="http://schemas.microsoft.com/office/word/2016/wordml/cid" xmlns:w16="http://schemas.microsoft.com/office/word/2018/wordml" xmlns:w16du="http://schemas.microsoft.com/office/word/2023/wordml/word16du" xmlns:w16sdtdh="http://schemas.microsoft.com/office/word/2020/wordml/sdtdatahash" xmlns:w16sdtfl="http://schemas.microsoft.com/office/word/2024/wordml/sdtformatlock" xmlns:w16se="http://schemas.microsoft.com/office/word/2015/wordml/symex" xmlns:wpg="http://schemas.microsoft.com/office/word/2010/wordprocessingGroup" xmlns:wpi="http://schemas.microsoft.com/office/word/2010/wordprocessingInk" xmlns:wne="http://schemas.microsoft.com/office/word/2006/wordml" xmlns:wps="http://schemas.microsoft.com/office/word/2010/wordprocessingShape" mc:Ignorable="w14 w15 w16se w16cid w16 w16cex w16sdtdh w16sdtfl w16du wp14">
   <w:footnote w:type="separator" w:id="-1">
     <w:p>
       <w:pPr>
@@ -5234,7 +5177,7 @@
 </file>
 
 <file path=word/header1.xml><?xml version="1.0" encoding="utf-8"?>
-<w:hdr xmlns:wpc="http://schemas.microsoft.com/office/word/2010/wordprocessingCanvas" xmlns:cx="http://schemas.microsoft.com/office/drawing/2014/chartex" xmlns:cx1="http://schemas.microsoft.com/office/drawing/2015/9/8/chartex" xmlns:cx2="http://schemas.microsoft.com/office/drawing/2015/10/21/chartex" xmlns:cx3="http://schemas.microsoft.com/office/drawing/2016/5/9/chartex" xmlns:cx4="http://schemas.microsoft.com/office/drawing/2016/5/10/chartex" xmlns:cx5="http://schemas.microsoft.com/office/drawing/2016/5/11/chartex" xmlns:cx6="http://schemas.microsoft.com/office/drawing/2016/5/12/chartex" xmlns:cx7="http://schemas.microsoft.com/office/drawing/2016/5/13/chartex" xmlns:cx8="http://schemas.microsoft.com/office/drawing/2016/5/14/chartex" xmlns:mc="http://schemas.openxmlformats.org/markup-compatibility/2006" xmlns:aink="http://schemas.microsoft.com/office/drawing/2016/ink" xmlns:am3d="http://schemas.microsoft.com/office/drawing/2017/model3d" xmlns:o="urn:schemas-microsoft-com:office:office" xmlns:oel="http://schemas.microsoft.com/office/2019/extlst" xmlns:r="http://schemas.openxmlformats.org/officeDocument/2006/relationships" xmlns:m="http://schemas.openxmlformats.org/officeDocument/2006/math" xmlns:v="urn:schemas-microsoft-com:vml" xmlns:wp14="http://schemas.microsoft.com/office/word/2010/wordprocessingDrawing" xmlns:wp="http://schemas.openxmlformats.org/drawingml/2006/wordprocessingDrawing" xmlns:w10="urn:schemas-microsoft-com:office:word" xmlns:w="http://schemas.openxmlformats.org/wordprocessingml/2006/main" xmlns:w14="http://schemas.microsoft.com/office/word/2010/wordml" xmlns:w15="http://schemas.microsoft.com/office/word/2012/wordml" xmlns:w16cex="http://schemas.microsoft.com/office/word/2018/wordml/cex" xmlns:w16cid="http://schemas.microsoft.com/office/word/2016/wordml/cid" xmlns:w16="http://schemas.microsoft.com/office/word/2018/wordml" xmlns:w16sdtdh="http://schemas.microsoft.com/office/word/2020/wordml/sdtdatahash" xmlns:w16se="http://schemas.microsoft.com/office/word/2015/wordml/symex" xmlns:wpg="http://schemas.microsoft.com/office/word/2010/wordprocessingGroup" xmlns:wpi="http://schemas.microsoft.com/office/word/2010/wordprocessingInk" xmlns:wne="http://schemas.microsoft.com/office/word/2006/wordml" xmlns:wps="http://schemas.microsoft.com/office/word/2010/wordprocessingShape" mc:Ignorable="w14 w15 w16se w16cid w16 w16cex w16sdtdh wp14">
+<w:hdr xmlns:wpc="http://schemas.microsoft.com/office/word/2010/wordprocessingCanvas" xmlns:cx="http://schemas.microsoft.com/office/drawing/2014/chartex" xmlns:cx1="http://schemas.microsoft.com/office/drawing/2015/9/8/chartex" xmlns:cx2="http://schemas.microsoft.com/office/drawing/2015/10/21/chartex" xmlns:cx3="http://schemas.microsoft.com/office/drawing/2016/5/9/chartex" xmlns:cx4="http://schemas.microsoft.com/office/drawing/2016/5/10/chartex" xmlns:cx5="http://schemas.microsoft.com/office/drawing/2016/5/11/chartex" xmlns:cx6="http://schemas.microsoft.com/office/drawing/2016/5/12/chartex" xmlns:cx7="http://schemas.microsoft.com/office/drawing/2016/5/13/chartex" xmlns:cx8="http://schemas.microsoft.com/office/drawing/2016/5/14/chartex" xmlns:mc="http://schemas.openxmlformats.org/markup-compatibility/2006" xmlns:aink="http://schemas.microsoft.com/office/drawing/2016/ink" xmlns:am3d="http://schemas.microsoft.com/office/drawing/2017/model3d" xmlns:o="urn:schemas-microsoft-com:office:office" xmlns:oel="http://schemas.microsoft.com/office/2019/extlst" xmlns:r="http://schemas.openxmlformats.org/officeDocument/2006/relationships" xmlns:m="http://schemas.openxmlformats.org/officeDocument/2006/math" xmlns:v="urn:schemas-microsoft-com:vml" xmlns:wp14="http://schemas.microsoft.com/office/word/2010/wordprocessingDrawing" xmlns:wp="http://schemas.openxmlformats.org/drawingml/2006/wordprocessingDrawing" xmlns:w10="urn:schemas-microsoft-com:office:word" xmlns:w="http://schemas.openxmlformats.org/wordprocessingml/2006/main" xmlns:w14="http://schemas.microsoft.com/office/word/2010/wordml" xmlns:w15="http://schemas.microsoft.com/office/word/2012/wordml" xmlns:w16cex="http://schemas.microsoft.com/office/word/2018/wordml/cex" xmlns:w16cid="http://schemas.microsoft.com/office/word/2016/wordml/cid" xmlns:w16="http://schemas.microsoft.com/office/word/2018/wordml" xmlns:w16du="http://schemas.microsoft.com/office/word/2023/wordml/word16du" xmlns:w16sdtdh="http://schemas.microsoft.com/office/word/2020/wordml/sdtdatahash" xmlns:w16sdtfl="http://schemas.microsoft.com/office/word/2024/wordml/sdtformatlock" xmlns:w16se="http://schemas.microsoft.com/office/word/2015/wordml/symex" xmlns:wpg="http://schemas.microsoft.com/office/word/2010/wordprocessingGroup" xmlns:wpi="http://schemas.microsoft.com/office/word/2010/wordprocessingInk" xmlns:wne="http://schemas.microsoft.com/office/word/2006/wordml" xmlns:wps="http://schemas.microsoft.com/office/word/2010/wordprocessingShape" mc:Ignorable="w14 w15 w16se w16cid w16 w16cex w16sdtdh w16sdtfl w16du wp14">
   <w:p>
     <w:pPr>
       <w:pStyle w:val="Header"/>
@@ -5251,7 +5194,7 @@
 </file>
 
 <file path=word/numbering.xml><?xml version="1.0" encoding="utf-8"?>
-<w:numbering xmlns:wpc="http://schemas.microsoft.com/office/word/2010/wordprocessingCanvas" xmlns:cx="http://schemas.microsoft.com/office/drawing/2014/chartex" xmlns:cx1="http://schemas.microsoft.com/office/drawing/2015/9/8/chartex" xmlns:cx2="http://schemas.microsoft.com/office/drawing/2015/10/21/chartex" xmlns:cx3="http://schemas.microsoft.com/office/drawing/2016/5/9/chartex" xmlns:cx4="http://schemas.microsoft.com/office/drawing/2016/5/10/chartex" xmlns:cx5="http://schemas.microsoft.com/office/drawing/2016/5/11/chartex" xmlns:cx6="http://schemas.microsoft.com/office/drawing/2016/5/12/chartex" xmlns:cx7="http://schemas.microsoft.com/office/drawing/2016/5/13/chartex" xmlns:cx8="http://schemas.microsoft.com/office/drawing/2016/5/14/chartex" xmlns:mc="http://schemas.openxmlformats.org/markup-compatibility/2006" xmlns:aink="http://schemas.microsoft.com/office/drawing/2016/ink" xmlns:am3d="http://schemas.microsoft.com/office/drawing/2017/model3d" xmlns:o="urn:schemas-microsoft-com:office:office" xmlns:oel="http://schemas.microsoft.com/office/2019/extlst" xmlns:r="http://schemas.openxmlformats.org/officeDocument/2006/relationships" xmlns:m="http://schemas.openxmlformats.org/officeDocument/2006/math" xmlns:v="urn:schemas-microsoft-com:vml" xmlns:wp14="http://schemas.microsoft.com/office/word/2010/wordprocessingDrawing" xmlns:wp="http://schemas.openxmlformats.org/drawingml/2006/wordprocessingDrawing" xmlns:w10="urn:schemas-microsoft-com:office:word" xmlns:w="http://schemas.openxmlformats.org/wordprocessingml/2006/main" xmlns:w14="http://schemas.microsoft.com/office/word/2010/wordml" xmlns:w15="http://schemas.microsoft.com/office/word/2012/wordml" xmlns:w16cex="http://schemas.microsoft.com/office/word/2018/wordml/cex" xmlns:w16cid="http://schemas.microsoft.com/office/word/2016/wordml/cid" xmlns:w16="http://schemas.microsoft.com/office/word/2018/wordml" xmlns:w16sdtdh="http://schemas.microsoft.com/office/word/2020/wordml/sdtdatahash" xmlns:w16se="http://schemas.microsoft.com/office/word/2015/wordml/symex" xmlns:wpg="http://schemas.microsoft.com/office/word/2010/wordprocessingGroup" xmlns:wpi="http://schemas.microsoft.com/office/word/2010/wordprocessingInk" xmlns:wne="http://schemas.microsoft.com/office/word/2006/wordml" xmlns:wps="http://schemas.microsoft.com/office/word/2010/wordprocessingShape" mc:Ignorable="w14 w15 w16se w16cid w16 w16cex w16sdtdh wp14">
+<w:numbering xmlns:wpc="http://schemas.microsoft.com/office/word/2010/wordprocessingCanvas" xmlns:cx="http://schemas.microsoft.com/office/drawing/2014/chartex" xmlns:cx1="http://schemas.microsoft.com/office/drawing/2015/9/8/chartex" xmlns:cx2="http://schemas.microsoft.com/office/drawing/2015/10/21/chartex" xmlns:cx3="http://schemas.microsoft.com/office/drawing/2016/5/9/chartex" xmlns:cx4="http://schemas.microsoft.com/office/drawing/2016/5/10/chartex" xmlns:cx5="http://schemas.microsoft.com/office/drawing/2016/5/11/chartex" xmlns:cx6="http://schemas.microsoft.com/office/drawing/2016/5/12/chartex" xmlns:cx7="http://schemas.microsoft.com/office/drawing/2016/5/13/chartex" xmlns:cx8="http://schemas.microsoft.com/office/drawing/2016/5/14/chartex" xmlns:mc="http://schemas.openxmlformats.org/markup-compatibility/2006" xmlns:aink="http://schemas.microsoft.com/office/drawing/2016/ink" xmlns:am3d="http://schemas.microsoft.com/office/drawing/2017/model3d" xmlns:o="urn:schemas-microsoft-com:office:office" xmlns:oel="http://schemas.microsoft.com/office/2019/extlst" xmlns:r="http://schemas.openxmlformats.org/officeDocument/2006/relationships" xmlns:m="http://schemas.openxmlformats.org/officeDocument/2006/math" xmlns:v="urn:schemas-microsoft-com:vml" xmlns:wp14="http://schemas.microsoft.com/office/word/2010/wordprocessingDrawing" xmlns:wp="http://schemas.openxmlformats.org/drawingml/2006/wordprocessingDrawing" xmlns:w10="urn:schemas-microsoft-com:office:word" xmlns:w="http://schemas.openxmlformats.org/wordprocessingml/2006/main" xmlns:w14="http://schemas.microsoft.com/office/word/2010/wordml" xmlns:w15="http://schemas.microsoft.com/office/word/2012/wordml" xmlns:w16cex="http://schemas.microsoft.com/office/word/2018/wordml/cex" xmlns:w16cid="http://schemas.microsoft.com/office/word/2016/wordml/cid" xmlns:w16="http://schemas.microsoft.com/office/word/2018/wordml" xmlns:w16du="http://schemas.microsoft.com/office/word/2023/wordml/word16du" xmlns:w16sdtdh="http://schemas.microsoft.com/office/word/2020/wordml/sdtdatahash" xmlns:w16sdtfl="http://schemas.microsoft.com/office/word/2024/wordml/sdtformatlock" xmlns:w16se="http://schemas.microsoft.com/office/word/2015/wordml/symex" xmlns:wpg="http://schemas.microsoft.com/office/word/2010/wordprocessingGroup" xmlns:wpi="http://schemas.microsoft.com/office/word/2010/wordprocessingInk" xmlns:wne="http://schemas.microsoft.com/office/word/2006/wordml" xmlns:wps="http://schemas.microsoft.com/office/word/2010/wordprocessingShape" mc:Ignorable="w14 w15 w16se w16cid w16 w16cex w16sdtdh w16sdtfl w16du wp14">
   <w:abstractNum w:abstractNumId="0" w15:restartNumberingAfterBreak="0">
     <w:nsid w:val="0B8111C5"/>
     <w:multiLevelType w:val="hybridMultilevel"/>
@@ -6416,7 +6359,7 @@
 </file>
 
 <file path=word/styles.xml><?xml version="1.0" encoding="utf-8"?>
-<w:styles xmlns:mc="http://schemas.openxmlformats.org/markup-compatibility/2006" xmlns:r="http://schemas.openxmlformats.org/officeDocument/2006/relationships" xmlns:w="http://schemas.openxmlformats.org/wordprocessingml/2006/main" xmlns:w14="http://schemas.microsoft.com/office/word/2010/wordml" xmlns:w15="http://schemas.microsoft.com/office/word/2012/wordml" xmlns:w16cex="http://schemas.microsoft.com/office/word/2018/wordml/cex" xmlns:w16cid="http://schemas.microsoft.com/office/word/2016/wordml/cid" xmlns:w16="http://schemas.microsoft.com/office/word/2018/wordml" xmlns:w16sdtdh="http://schemas.microsoft.com/office/word/2020/wordml/sdtdatahash" xmlns:w16se="http://schemas.microsoft.com/office/word/2015/wordml/symex" mc:Ignorable="w14 w15 w16se w16cid w16 w16cex w16sdtdh">
+<w:styles xmlns:mc="http://schemas.openxmlformats.org/markup-compatibility/2006" xmlns:r="http://schemas.openxmlformats.org/officeDocument/2006/relationships" xmlns:w="http://schemas.openxmlformats.org/wordprocessingml/2006/main" xmlns:w14="http://schemas.microsoft.com/office/word/2010/wordml" xmlns:w15="http://schemas.microsoft.com/office/word/2012/wordml" xmlns:w16cex="http://schemas.microsoft.com/office/word/2018/wordml/cex" xmlns:w16cid="http://schemas.microsoft.com/office/word/2016/wordml/cid" xmlns:w16="http://schemas.microsoft.com/office/word/2018/wordml" xmlns:w16du="http://schemas.microsoft.com/office/word/2023/wordml/word16du" xmlns:w16sdtdh="http://schemas.microsoft.com/office/word/2020/wordml/sdtdatahash" xmlns:w16sdtfl="http://schemas.microsoft.com/office/word/2024/wordml/sdtformatlock" xmlns:w16se="http://schemas.microsoft.com/office/word/2015/wordml/symex" mc:Ignorable="w14 w15 w16se w16cid w16 w16cex w16sdtdh w16sdtfl w16du">
   <w:docDefaults>
     <w:rPrDefault>
       <w:rPr>

</xml_diff>

<commit_message>
updated the Penetration Testing Report (corrected a typo)
</commit_message>
<xml_diff>
--- a/source/reference_documents/secondary_documents/verification phase/Penetration Testing Report/Penetration Testing Report.docx
+++ b/source/reference_documents/secondary_documents/verification phase/Penetration Testing Report/Penetration Testing Report.docx
@@ -28,7 +28,7 @@
         <w:t xml:space="preserve">Version </w:t>
       </w:r>
       <w:r>
-        <w:t>8</w:t>
+        <w:t>9</w:t>
       </w:r>
     </w:p>
     <w:p>
@@ -45,7 +45,7 @@
         <w:rPr>
           <w:noProof/>
         </w:rPr>
-        <w:t>1/21/26 8:26 AM</w:t>
+        <w:t>1/21/26 8:39 AM</w:t>
       </w:r>
       <w:r>
         <w:fldChar w:fldCharType="end"/>
@@ -4506,7 +4506,14 @@
           <w:b/>
           <w:bCs/>
         </w:rPr>
-        <w:t>Security SME</w:t>
+        <w:t>Penetration Testing</w:t>
+      </w:r>
+      <w:r>
+        <w:rPr>
+          <w:b/>
+          <w:bCs/>
+        </w:rPr>
+        <w:t xml:space="preserve"> SME</w:t>
       </w:r>
       <w:r>
         <w:t xml:space="preserve"> and </w:t>

</xml_diff>

<commit_message>
Updated the Penetration Testing Report secondary document (misattribution of triage task to security SME instead of penetration testing SME as indicated in the diagram)
</commit_message>
<xml_diff>
--- a/source/reference_documents/secondary_documents/verification phase/Penetration Testing Report/Penetration Testing Report.docx
+++ b/source/reference_documents/secondary_documents/verification phase/Penetration Testing Report/Penetration Testing Report.docx
@@ -28,7 +28,7 @@
         <w:t xml:space="preserve">Version </w:t>
       </w:r>
       <w:r>
-        <w:t>9</w:t>
+        <w:t>10</w:t>
       </w:r>
     </w:p>
     <w:p>
@@ -45,7 +45,7 @@
         <w:rPr>
           <w:noProof/>
         </w:rPr>
-        <w:t>1/21/26 8:39 AM</w:t>
+        <w:t>4/9/26 1:34 PM</w:t>
       </w:r>
       <w:r>
         <w:fldChar w:fldCharType="end"/>
@@ -4418,7 +4418,10 @@
               <w:spacing w:line="240" w:lineRule="auto"/>
             </w:pPr>
             <w:r>
-              <w:t>Security SME</w:t>
+              <w:t>Penetration Testing</w:t>
+            </w:r>
+            <w:r>
+              <w:t xml:space="preserve"> SME</w:t>
             </w:r>
           </w:p>
           <w:p>

</xml_diff>